<commit_message>
docs: cap nhat bao cao nop cuoi DT028 (sua trinh bay, bo sung chu ky)
</commit_message>
<xml_diff>
--- a/docs/baocao-cuoi/N24DCDT034_DT028_PhanDucHuy_BaoCao.docx
+++ b/docs/baocao-cuoi/N24DCDT034_DT028_PhanDucHuy_BaoCao.docx
@@ -1993,18 +1993,51 @@
         <w:pStyle w:val="Nidung"/>
       </w:pPr>
       <w:r>
-        <w:t>Tôi xin cam đoan toàn bộ nội dung báo cáo này do chính tôi thực hiện: tự đọc giáo trình, tự cài đặt hai tìm kiếm nhị phân tìm biên, tự viết bộ kiểm thử, tự chạy và chụp bằng chứng. Các đoạn mã, bảng truy vết và kết quả là sản phẩm của riêng tôi, không sao chép của người khác. Mã mẫu của giảng viên chỉ dùng để tham khảo cách tổ chức và đã nêu ở tài liệu tham khảo.</w:t>
+        <w:t>Em xin chịu trách nhiệm về toàn bộ nội dung của báo cáo này. Phần đọc giáo trình, hai hàm tìm biên, bộ kiểm thử, các lần chạy và ảnh chụp đều do em trực tiếp thực hiện; số liệu trong các bảng được lấy nguyên từ log của những lần chạy đó, không chỉnh sửa lại. Những chỗ có dựa vào tài liệu hay mã mẫu của giảng viên đều được ghi rõ nguồn ở phần tài liệu tham khảo, và em không sử dụng bài làm của sinh viên khác.</w:t>
       </w:r>
     </w:p>
     <w:p>
       <w:pPr>
         <w:pStyle w:val="Nidung"/>
-        <w:spacing w:before="0" w:after="100" w:line="269" w:lineRule="auto"/>
+        <w:spacing w:before="360" w:after="100" w:line="269" w:lineRule="auto"/>
         <w:ind w:firstLine="0"/>
         <w:jc w:val="center"/>
       </w:pPr>
       <w:r>
-        <w:t>TP. Hồ Chí Minh, ngày ...... tháng ...... năm 2026</w:t>
+        <w:t>TP. Hồ Chí Minh, ngày 23 tháng 10 năm 2026</w:t>
+      </w:r>
+    </w:p>
+    <w:p>
+      <w:pPr>
+        <w:jc w:val="center"/>
+      </w:pPr>
+      <w:r>
+        <w:t>Sinh viên thực hiện</w:t>
+      </w:r>
+    </w:p>
+    <w:p>
+      <w:pPr>
+        <w:jc w:val="center"/>
+      </w:pPr>
+      <w:r>
+        <w:t>(Ký và ghi rõ họ tên)</w:t>
+      </w:r>
+    </w:p>
+    <w:p>
+      <w:pPr>
+        <w:jc w:val="center"/>
+      </w:pPr>
+    </w:p>
+    <w:p>
+      <w:pPr>
+        <w:jc w:val="center"/>
+      </w:pPr>
+      <w:r>
+        <w:rPr>
+          <w:b/>
+          <w:sz w:val="26"/>
+        </w:rPr>
+        <w:t>PHAN ĐỨC HUY</w:t>
       </w:r>
     </w:p>
     <w:p>
@@ -2025,7 +2058,7 @@
         <w:pStyle w:val="Nidung"/>
       </w:pPr>
       <w:r>
-        <w:t>Em xin chân thành cảm ơn giảng viên Hồ Nhựt Minh đã hướng dẫn, giao đề tài, cung cấp khung báo cáo và tài liệu tham khảo để em hoàn thành đồ án học phần Cấu trúc dữ liệu và Giải thuật.</w:t>
+        <w:t>Bài làm này hoàn thành được nhờ hướng dẫn của thầy Hồ Nhựt Minh: thầy chỉ cách đọc mục 2.6.2, cách chọn ca biên cho trường hợp khóa trùng và cách trình bày bảng truy vết sao cho người đọc dò lại được từng bước. Em cũng cảm ơn quý thầy cô đã giảng phần tìm kiếm nhị phân trong học phần, nhờ đó em hiểu vì sao phải tách hẳn hai lần tìm thay vì gọi một hàm có sẵn.</w:t>
       </w:r>
     </w:p>
     <w:p>
@@ -2046,7 +2079,7 @@
         <w:pStyle w:val="Nidung"/>
       </w:pPr>
       <w:r>
-        <w:t>Đồ án trình bày bài toán tìm vị trí xuất hiện đầu tiên, vị trí xuất hiện cuối cùng và tần suất của khóa x trên mảng số nguyên đã tăng không giảm. Hai tìm kiếm nhị phân độc lập được tự cài: bản tìm đầu thu hẹp sang trái khi gặp x, bản tìm cuối thu hẹp sang phải; tần suất bằng last − first + 1 và chỉ tính khi x đã được xác nhận có mặt. Kết quả chạy thật cho thấy mỗi lần tìm chỉ cần O(log n) lần xét mid, tổng hai lần vẫn O(log n) và bộ nhớ phụ O(1). Sản phẩm gồm mã nguồn Julia, bộ kiểm thử 12 ca chức năng kèm ca lỗi, 9 ảnh minh chứng chạy thật và báo cáo theo mẫu.</w:t>
+        <w:t>Báo cáo giải bài toán tìm vị trí đầu, vị trí cuối và tần suất của khóa x trong một mảng số nguyên đã sắp tăng. Cách làm là cài tay hai lần tìm nhị phân: lần thứ nhất thu hẹp về bên trái mỗi khi gặp x để lấy biên đầu, lần thứ hai thu hẹp về bên phải để lấy biên cuối; tần suất chỉ được tính bằng last − first + 1 sau khi đã xác nhận x có mặt. Số liệu chạy thật cho thấy mỗi lần tìm không quá ⌈log₂(n+1)⌉ lần xét mid, cộng lại vẫn O(log n) và không tốn thêm bộ nhớ phụ. Bài nộp gồm mã Julia, bộ kiểm thử 13 ca có mã (12 ca chức năng và 1 ca dữ liệu sai), 11 ảnh chụp từ lần chạy thật và báo cáo theo khung của môn.</w:t>
       </w:r>
     </w:p>
     <w:p>
@@ -2092,25 +2125,22 @@
           <w14:ligatures w14:val="standardContextual"/>
         </w:rPr>
       </w:pPr>
-      <w:hyperlink w:anchor="_Toc243433142" w:history="1">
-        <w:r>
-          <w:rPr>
-            <w:rFonts w:eastAsiaTheme="majorEastAsia"/>
-            <w:noProof/>
-            <w:color w:val="auto"/>
-          </w:rPr>
-          <w:t>PHIẾU GIAO ĐỀ TÀI</w:t>
-        </w:r>
-        <w:r>
-          <w:rPr>
-            <w:noProof/>
-            <w:webHidden/>
-            <w:color w:val="auto"/>
-          </w:rPr>
-          <w:tab/>
-          <w:t>i</w:t>
-        </w:r>
-      </w:hyperlink>
+      <w:r>
+        <w:rPr>
+          <w:rFonts w:eastAsiaTheme="majorEastAsia"/>
+          <w:noProof/>
+          <w:color w:val="auto"/>
+        </w:rPr>
+        <w:t>PHIẾU GIAO ĐỀ TÀI</w:t>
+      </w:r>
+      <w:r>
+        <w:rPr>
+          <w:noProof/>
+          <w:color w:val="auto"/>
+        </w:rPr>
+        <w:tab/>
+        <w:t>i</w:t>
+      </w:r>
     </w:p>
     <w:p>
       <w:pPr>
@@ -2128,25 +2158,22 @@
           <w14:ligatures w14:val="standardContextual"/>
         </w:rPr>
       </w:pPr>
-      <w:hyperlink w:anchor="_Toc243433143" w:history="1">
-        <w:r>
-          <w:rPr>
-            <w:rFonts w:eastAsiaTheme="majorEastAsia"/>
-            <w:noProof/>
-            <w:color w:val="auto"/>
-          </w:rPr>
-          <w:t>PHIẾU CHẤM VÀ ĐỐI CHIẾU MINH CHỨNG</w:t>
-        </w:r>
-        <w:r>
-          <w:rPr>
-            <w:noProof/>
-            <w:webHidden/>
-            <w:color w:val="auto"/>
-          </w:rPr>
-          <w:tab/>
-          <w:t>iii</w:t>
-        </w:r>
-      </w:hyperlink>
+      <w:r>
+        <w:rPr>
+          <w:rFonts w:eastAsiaTheme="majorEastAsia"/>
+          <w:noProof/>
+          <w:color w:val="auto"/>
+        </w:rPr>
+        <w:t>PHIẾU CHẤM VÀ ĐỐI CHIẾU MINH CHỨNG</w:t>
+      </w:r>
+      <w:r>
+        <w:rPr>
+          <w:noProof/>
+          <w:color w:val="auto"/>
+        </w:rPr>
+        <w:tab/>
+        <w:t>iii</w:t>
+      </w:r>
     </w:p>
     <w:p>
       <w:pPr>
@@ -2164,25 +2191,22 @@
           <w14:ligatures w14:val="standardContextual"/>
         </w:rPr>
       </w:pPr>
-      <w:hyperlink w:anchor="_Toc243433144" w:history="1">
-        <w:r>
-          <w:rPr>
-            <w:rFonts w:eastAsiaTheme="majorEastAsia"/>
-            <w:noProof/>
-            <w:color w:val="auto"/>
-          </w:rPr>
-          <w:t>CÁCH ĐỐI CHIẾU RUBRIC</w:t>
-        </w:r>
-        <w:r>
-          <w:rPr>
-            <w:noProof/>
-            <w:webHidden/>
-            <w:color w:val="auto"/>
-          </w:rPr>
-          <w:tab/>
-          <w:t>iv</w:t>
-        </w:r>
-      </w:hyperlink>
+      <w:r>
+        <w:rPr>
+          <w:rFonts w:eastAsiaTheme="majorEastAsia"/>
+          <w:noProof/>
+          <w:color w:val="auto"/>
+        </w:rPr>
+        <w:t>CÁCH ĐỐI CHIẾU RUBRIC</w:t>
+      </w:r>
+      <w:r>
+        <w:rPr>
+          <w:noProof/>
+          <w:color w:val="auto"/>
+        </w:rPr>
+        <w:tab/>
+        <w:t>iv</w:t>
+      </w:r>
     </w:p>
     <w:p>
       <w:pPr>
@@ -2200,25 +2224,22 @@
           <w14:ligatures w14:val="standardContextual"/>
         </w:rPr>
       </w:pPr>
-      <w:hyperlink w:anchor="_Toc243433145" w:history="1">
-        <w:r>
-          <w:rPr>
-            <w:rFonts w:eastAsiaTheme="majorEastAsia"/>
-            <w:noProof/>
-            <w:color w:val="auto"/>
-          </w:rPr>
-          <w:t>LỜI CAM ĐOAN</w:t>
-        </w:r>
-        <w:r>
-          <w:rPr>
-            <w:noProof/>
-            <w:webHidden/>
-            <w:color w:val="auto"/>
-          </w:rPr>
-          <w:tab/>
-          <w:t>v</w:t>
-        </w:r>
-      </w:hyperlink>
+      <w:r>
+        <w:rPr>
+          <w:rFonts w:eastAsiaTheme="majorEastAsia"/>
+          <w:noProof/>
+          <w:color w:val="auto"/>
+        </w:rPr>
+        <w:t>LỜI CAM ĐOAN</w:t>
+      </w:r>
+      <w:r>
+        <w:rPr>
+          <w:noProof/>
+          <w:color w:val="auto"/>
+        </w:rPr>
+        <w:tab/>
+        <w:t>v</w:t>
+      </w:r>
     </w:p>
     <w:p>
       <w:pPr>
@@ -2236,25 +2257,22 @@
           <w14:ligatures w14:val="standardContextual"/>
         </w:rPr>
       </w:pPr>
-      <w:hyperlink w:anchor="_Toc243433146" w:history="1">
-        <w:r>
-          <w:rPr>
-            <w:rFonts w:eastAsiaTheme="majorEastAsia"/>
-            <w:noProof/>
-            <w:color w:val="auto"/>
-          </w:rPr>
-          <w:t>LỜI CẢM ƠN</w:t>
-        </w:r>
-        <w:r>
-          <w:rPr>
-            <w:noProof/>
-            <w:webHidden/>
-            <w:color w:val="auto"/>
-          </w:rPr>
-          <w:tab/>
-          <w:t>vi</w:t>
-        </w:r>
-      </w:hyperlink>
+      <w:r>
+        <w:rPr>
+          <w:rFonts w:eastAsiaTheme="majorEastAsia"/>
+          <w:noProof/>
+          <w:color w:val="auto"/>
+        </w:rPr>
+        <w:t>LỜI CẢM ƠN</w:t>
+      </w:r>
+      <w:r>
+        <w:rPr>
+          <w:noProof/>
+          <w:color w:val="auto"/>
+        </w:rPr>
+        <w:tab/>
+        <w:t>vi</w:t>
+      </w:r>
     </w:p>
     <w:p>
       <w:pPr>
@@ -2272,25 +2290,22 @@
           <w14:ligatures w14:val="standardContextual"/>
         </w:rPr>
       </w:pPr>
-      <w:hyperlink w:anchor="_Toc243433147" w:history="1">
-        <w:r>
-          <w:rPr>
-            <w:rFonts w:eastAsiaTheme="majorEastAsia"/>
-            <w:noProof/>
-            <w:color w:val="auto"/>
-          </w:rPr>
-          <w:t>TÓM TẮT</w:t>
-        </w:r>
-        <w:r>
-          <w:rPr>
-            <w:noProof/>
-            <w:webHidden/>
-            <w:color w:val="auto"/>
-          </w:rPr>
-          <w:tab/>
-          <w:t>vii</w:t>
-        </w:r>
-      </w:hyperlink>
+      <w:r>
+        <w:rPr>
+          <w:rFonts w:eastAsiaTheme="majorEastAsia"/>
+          <w:noProof/>
+          <w:color w:val="auto"/>
+        </w:rPr>
+        <w:t>TÓM TẮT</w:t>
+      </w:r>
+      <w:r>
+        <w:rPr>
+          <w:noProof/>
+          <w:color w:val="auto"/>
+        </w:rPr>
+        <w:tab/>
+        <w:t>vii</w:t>
+      </w:r>
     </w:p>
     <w:p>
       <w:pPr>
@@ -2308,25 +2323,22 @@
           <w14:ligatures w14:val="standardContextual"/>
         </w:rPr>
       </w:pPr>
-      <w:hyperlink w:anchor="_Toc243433148" w:history="1">
-        <w:r>
-          <w:rPr>
-            <w:rFonts w:eastAsiaTheme="majorEastAsia"/>
-            <w:noProof/>
-            <w:color w:val="auto"/>
-          </w:rPr>
-          <w:t>CHƯƠNG 1. TỔNG QUAN ĐỀ TÀI</w:t>
-        </w:r>
-        <w:r>
-          <w:rPr>
-            <w:noProof/>
-            <w:webHidden/>
-            <w:color w:val="auto"/>
-          </w:rPr>
-          <w:tab/>
-          <w:t>1</w:t>
-        </w:r>
-      </w:hyperlink>
+      <w:r>
+        <w:rPr>
+          <w:rFonts w:eastAsiaTheme="majorEastAsia"/>
+          <w:noProof/>
+          <w:color w:val="auto"/>
+        </w:rPr>
+        <w:t>CHƯƠNG 1. TỔNG QUAN ĐỀ TÀI</w:t>
+      </w:r>
+      <w:r>
+        <w:rPr>
+          <w:noProof/>
+          <w:color w:val="auto"/>
+        </w:rPr>
+        <w:tab/>
+        <w:t>1</w:t>
+      </w:r>
     </w:p>
     <w:p>
       <w:pPr>
@@ -2344,25 +2356,22 @@
           <w14:ligatures w14:val="standardContextual"/>
         </w:rPr>
       </w:pPr>
-      <w:hyperlink w:anchor="_Toc243433149" w:history="1">
-        <w:r>
-          <w:rPr>
-            <w:rFonts w:eastAsiaTheme="majorEastAsia"/>
-            <w:noProof/>
-            <w:color w:val="auto"/>
-          </w:rPr>
-          <w:t>1.1. Bài toán và lý do thực hiện</w:t>
-        </w:r>
-        <w:r>
-          <w:rPr>
-            <w:noProof/>
-            <w:webHidden/>
-            <w:color w:val="auto"/>
-          </w:rPr>
-          <w:tab/>
-          <w:t>1</w:t>
-        </w:r>
-      </w:hyperlink>
+      <w:r>
+        <w:rPr>
+          <w:rFonts w:eastAsiaTheme="majorEastAsia"/>
+          <w:noProof/>
+          <w:color w:val="auto"/>
+        </w:rPr>
+        <w:t>1.1. Bài toán và lý do thực hiện</w:t>
+      </w:r>
+      <w:r>
+        <w:rPr>
+          <w:noProof/>
+          <w:color w:val="auto"/>
+        </w:rPr>
+        <w:tab/>
+        <w:t>1</w:t>
+      </w:r>
     </w:p>
     <w:p>
       <w:pPr>
@@ -2380,25 +2389,22 @@
           <w14:ligatures w14:val="standardContextual"/>
         </w:rPr>
       </w:pPr>
-      <w:hyperlink w:anchor="_Toc243433150" w:history="1">
-        <w:r>
-          <w:rPr>
-            <w:rFonts w:eastAsiaTheme="majorEastAsia"/>
-            <w:noProof/>
-            <w:color w:val="auto"/>
-          </w:rPr>
-          <w:t>1.2. Mục tiêu và sản phẩm</w:t>
-        </w:r>
-        <w:r>
-          <w:rPr>
-            <w:noProof/>
-            <w:webHidden/>
-            <w:color w:val="auto"/>
-          </w:rPr>
-          <w:tab/>
-          <w:t>1</w:t>
-        </w:r>
-      </w:hyperlink>
+      <w:r>
+        <w:rPr>
+          <w:rFonts w:eastAsiaTheme="majorEastAsia"/>
+          <w:noProof/>
+          <w:color w:val="auto"/>
+        </w:rPr>
+        <w:t>1.2. Mục tiêu và sản phẩm</w:t>
+      </w:r>
+      <w:r>
+        <w:rPr>
+          <w:noProof/>
+          <w:color w:val="auto"/>
+        </w:rPr>
+        <w:tab/>
+        <w:t>1</w:t>
+      </w:r>
     </w:p>
     <w:p>
       <w:pPr>
@@ -2416,25 +2422,22 @@
           <w14:ligatures w14:val="standardContextual"/>
         </w:rPr>
       </w:pPr>
-      <w:hyperlink w:anchor="_Toc243433151" w:history="1">
-        <w:r>
-          <w:rPr>
-            <w:rFonts w:eastAsiaTheme="majorEastAsia"/>
-            <w:noProof/>
-            <w:color w:val="auto"/>
-          </w:rPr>
-          <w:t>1.3. Phạm vi, đầu vào và đầu ra</w:t>
-        </w:r>
-        <w:r>
-          <w:rPr>
-            <w:noProof/>
-            <w:webHidden/>
-            <w:color w:val="auto"/>
-          </w:rPr>
-          <w:tab/>
-          <w:t>1</w:t>
-        </w:r>
-      </w:hyperlink>
+      <w:r>
+        <w:rPr>
+          <w:rFonts w:eastAsiaTheme="majorEastAsia"/>
+          <w:noProof/>
+          <w:color w:val="auto"/>
+        </w:rPr>
+        <w:t>1.3. Phạm vi, đầu vào và đầu ra</w:t>
+      </w:r>
+      <w:r>
+        <w:rPr>
+          <w:noProof/>
+          <w:color w:val="auto"/>
+        </w:rPr>
+        <w:tab/>
+        <w:t>1</w:t>
+      </w:r>
     </w:p>
     <w:p>
       <w:pPr>
@@ -2452,25 +2455,22 @@
           <w14:ligatures w14:val="standardContextual"/>
         </w:rPr>
       </w:pPr>
-      <w:hyperlink w:anchor="_Toc243433152" w:history="1">
-        <w:r>
-          <w:rPr>
-            <w:rFonts w:eastAsiaTheme="majorEastAsia"/>
-            <w:noProof/>
-            <w:color w:val="auto"/>
-          </w:rPr>
-          <w:t>1.4. Cách thực hiện và cấu trúc báo cáo</w:t>
-        </w:r>
-        <w:r>
-          <w:rPr>
-            <w:noProof/>
-            <w:webHidden/>
-            <w:color w:val="auto"/>
-          </w:rPr>
-          <w:tab/>
-          <w:t>2</w:t>
-        </w:r>
-      </w:hyperlink>
+      <w:r>
+        <w:rPr>
+          <w:rFonts w:eastAsiaTheme="majorEastAsia"/>
+          <w:noProof/>
+          <w:color w:val="auto"/>
+        </w:rPr>
+        <w:t>1.4. Cách thực hiện và cấu trúc báo cáo</w:t>
+      </w:r>
+      <w:r>
+        <w:rPr>
+          <w:noProof/>
+          <w:color w:val="auto"/>
+        </w:rPr>
+        <w:tab/>
+        <w:t>2</w:t>
+      </w:r>
     </w:p>
     <w:p>
       <w:pPr>
@@ -2488,25 +2488,22 @@
           <w14:ligatures w14:val="standardContextual"/>
         </w:rPr>
       </w:pPr>
-      <w:hyperlink w:anchor="_Toc243433153" w:history="1">
-        <w:r>
-          <w:rPr>
-            <w:rFonts w:eastAsiaTheme="majorEastAsia"/>
-            <w:noProof/>
-            <w:color w:val="auto"/>
-          </w:rPr>
-          <w:t>CHƯƠNG 2. CƠ SỞ LÝ THUYẾT</w:t>
-        </w:r>
-        <w:r>
-          <w:rPr>
-            <w:noProof/>
-            <w:webHidden/>
-            <w:color w:val="auto"/>
-          </w:rPr>
-          <w:tab/>
-          <w:t>4</w:t>
-        </w:r>
-      </w:hyperlink>
+      <w:r>
+        <w:rPr>
+          <w:rFonts w:eastAsiaTheme="majorEastAsia"/>
+          <w:noProof/>
+          <w:color w:val="auto"/>
+        </w:rPr>
+        <w:t>CHƯƠNG 2. CƠ SỞ LÝ THUYẾT</w:t>
+      </w:r>
+      <w:r>
+        <w:rPr>
+          <w:noProof/>
+          <w:color w:val="auto"/>
+        </w:rPr>
+        <w:tab/>
+        <w:t>4</w:t>
+      </w:r>
     </w:p>
     <w:p>
       <w:pPr>
@@ -2524,25 +2521,22 @@
           <w14:ligatures w14:val="standardContextual"/>
         </w:rPr>
       </w:pPr>
-      <w:hyperlink w:anchor="_Toc243433154" w:history="1">
-        <w:r>
-          <w:rPr>
-            <w:rFonts w:eastAsiaTheme="majorEastAsia"/>
-            <w:noProof/>
-            <w:color w:val="auto"/>
-          </w:rPr>
-          <w:t>2.1. Khái niệm và mô hình dữ liệu</w:t>
-        </w:r>
-        <w:r>
-          <w:rPr>
-            <w:noProof/>
-            <w:webHidden/>
-            <w:color w:val="auto"/>
-          </w:rPr>
-          <w:tab/>
-          <w:t>4</w:t>
-        </w:r>
-      </w:hyperlink>
+      <w:r>
+        <w:rPr>
+          <w:rFonts w:eastAsiaTheme="majorEastAsia"/>
+          <w:noProof/>
+          <w:color w:val="auto"/>
+        </w:rPr>
+        <w:t>2.1. Khái niệm và mô hình dữ liệu</w:t>
+      </w:r>
+      <w:r>
+        <w:rPr>
+          <w:noProof/>
+          <w:color w:val="auto"/>
+        </w:rPr>
+        <w:tab/>
+        <w:t>4</w:t>
+      </w:r>
     </w:p>
     <w:p>
       <w:pPr>
@@ -2560,25 +2554,22 @@
           <w14:ligatures w14:val="standardContextual"/>
         </w:rPr>
       </w:pPr>
-      <w:hyperlink w:anchor="_Toc243433155" w:history="1">
-        <w:r>
-          <w:rPr>
-            <w:rFonts w:eastAsiaTheme="majorEastAsia"/>
-            <w:noProof/>
-            <w:color w:val="auto"/>
-          </w:rPr>
-          <w:t>2.2. Cấu trúc dữ liệu sử dụng</w:t>
-        </w:r>
-        <w:r>
-          <w:rPr>
-            <w:noProof/>
-            <w:webHidden/>
-            <w:color w:val="auto"/>
-          </w:rPr>
-          <w:tab/>
-          <w:t>4</w:t>
-        </w:r>
-      </w:hyperlink>
+      <w:r>
+        <w:rPr>
+          <w:rFonts w:eastAsiaTheme="majorEastAsia"/>
+          <w:noProof/>
+          <w:color w:val="auto"/>
+        </w:rPr>
+        <w:t>2.2. Cấu trúc dữ liệu sử dụng</w:t>
+      </w:r>
+      <w:r>
+        <w:rPr>
+          <w:noProof/>
+          <w:color w:val="auto"/>
+        </w:rPr>
+        <w:tab/>
+        <w:t>4</w:t>
+      </w:r>
     </w:p>
     <w:p>
       <w:pPr>
@@ -2596,25 +2587,22 @@
           <w14:ligatures w14:val="standardContextual"/>
         </w:rPr>
       </w:pPr>
-      <w:hyperlink w:anchor="_Toc243433156" w:history="1">
-        <w:r>
-          <w:rPr>
-            <w:rFonts w:eastAsiaTheme="majorEastAsia"/>
-            <w:noProof/>
-            <w:color w:val="auto"/>
-          </w:rPr>
-          <w:t>2.3. Nguyên lý thuật toán</w:t>
-        </w:r>
-        <w:r>
-          <w:rPr>
-            <w:noProof/>
-            <w:webHidden/>
-            <w:color w:val="auto"/>
-          </w:rPr>
-          <w:tab/>
-          <w:t>5</w:t>
-        </w:r>
-      </w:hyperlink>
+      <w:r>
+        <w:rPr>
+          <w:rFonts w:eastAsiaTheme="majorEastAsia"/>
+          <w:noProof/>
+          <w:color w:val="auto"/>
+        </w:rPr>
+        <w:t>2.3. Nguyên lý thuật toán</w:t>
+      </w:r>
+      <w:r>
+        <w:rPr>
+          <w:noProof/>
+          <w:color w:val="auto"/>
+        </w:rPr>
+        <w:tab/>
+        <w:t>5</w:t>
+      </w:r>
     </w:p>
     <w:p>
       <w:pPr>
@@ -2632,25 +2620,22 @@
           <w14:ligatures w14:val="standardContextual"/>
         </w:rPr>
       </w:pPr>
-      <w:hyperlink w:anchor="_Toc243433157" w:history="1">
-        <w:r>
-          <w:rPr>
-            <w:rFonts w:eastAsiaTheme="majorEastAsia"/>
-            <w:noProof/>
-            <w:color w:val="auto"/>
-          </w:rPr>
-          <w:t>2.4. Cơ sở đánh giá thời gian và bộ nhớ</w:t>
-        </w:r>
-        <w:r>
-          <w:rPr>
-            <w:noProof/>
-            <w:webHidden/>
-            <w:color w:val="auto"/>
-          </w:rPr>
-          <w:tab/>
-          <w:t>5</w:t>
-        </w:r>
-      </w:hyperlink>
+      <w:r>
+        <w:rPr>
+          <w:rFonts w:eastAsiaTheme="majorEastAsia"/>
+          <w:noProof/>
+          <w:color w:val="auto"/>
+        </w:rPr>
+        <w:t>2.4. Cơ sở đánh giá thời gian và bộ nhớ</w:t>
+      </w:r>
+      <w:r>
+        <w:rPr>
+          <w:noProof/>
+          <w:color w:val="auto"/>
+        </w:rPr>
+        <w:tab/>
+        <w:t>5</w:t>
+      </w:r>
     </w:p>
     <w:p>
       <w:pPr>
@@ -2668,25 +2653,22 @@
           <w14:ligatures w14:val="standardContextual"/>
         </w:rPr>
       </w:pPr>
-      <w:hyperlink w:anchor="_Toc243433158" w:history="1">
-        <w:r>
-          <w:rPr>
-            <w:rFonts w:eastAsiaTheme="majorEastAsia"/>
-            <w:noProof/>
-            <w:color w:val="auto"/>
-          </w:rPr>
-          <w:t>CHƯƠNG 3. PHÂN TÍCH, THIẾT KẾ VÀ CÀI ĐẶT</w:t>
-        </w:r>
-        <w:r>
-          <w:rPr>
-            <w:noProof/>
-            <w:webHidden/>
-            <w:color w:val="auto"/>
-          </w:rPr>
-          <w:tab/>
-          <w:t>6</w:t>
-        </w:r>
-      </w:hyperlink>
+      <w:r>
+        <w:rPr>
+          <w:rFonts w:eastAsiaTheme="majorEastAsia"/>
+          <w:noProof/>
+          <w:color w:val="auto"/>
+        </w:rPr>
+        <w:t>CHƯƠNG 3. PHÂN TÍCH, THIẾT KẾ VÀ CÀI ĐẶT</w:t>
+      </w:r>
+      <w:r>
+        <w:rPr>
+          <w:noProof/>
+          <w:color w:val="auto"/>
+        </w:rPr>
+        <w:tab/>
+        <w:t>6</w:t>
+      </w:r>
     </w:p>
     <w:p>
       <w:pPr>
@@ -2704,25 +2686,22 @@
           <w14:ligatures w14:val="standardContextual"/>
         </w:rPr>
       </w:pPr>
-      <w:hyperlink w:anchor="_Toc243433159" w:history="1">
-        <w:r>
-          <w:rPr>
-            <w:rFonts w:eastAsiaTheme="majorEastAsia"/>
-            <w:noProof/>
-            <w:color w:val="auto"/>
-          </w:rPr>
-          <w:t>3.1. Phân tích yêu cầu chương trình</w:t>
-        </w:r>
-        <w:r>
-          <w:rPr>
-            <w:noProof/>
-            <w:webHidden/>
-            <w:color w:val="auto"/>
-          </w:rPr>
-          <w:tab/>
-          <w:t>6</w:t>
-        </w:r>
-      </w:hyperlink>
+      <w:r>
+        <w:rPr>
+          <w:rFonts w:eastAsiaTheme="majorEastAsia"/>
+          <w:noProof/>
+          <w:color w:val="auto"/>
+        </w:rPr>
+        <w:t>3.1. Phân tích yêu cầu chương trình</w:t>
+      </w:r>
+      <w:r>
+        <w:rPr>
+          <w:noProof/>
+          <w:color w:val="auto"/>
+        </w:rPr>
+        <w:tab/>
+        <w:t>6</w:t>
+      </w:r>
     </w:p>
     <w:p>
       <w:pPr>
@@ -2740,25 +2719,22 @@
           <w14:ligatures w14:val="standardContextual"/>
         </w:rPr>
       </w:pPr>
-      <w:hyperlink w:anchor="_Toc243433160" w:history="1">
-        <w:r>
-          <w:rPr>
-            <w:rFonts w:eastAsiaTheme="majorEastAsia"/>
-            <w:noProof/>
-            <w:color w:val="auto"/>
-          </w:rPr>
-          <w:t>3.2. Thiết kế các hàm và dữ liệu</w:t>
-        </w:r>
-        <w:r>
-          <w:rPr>
-            <w:noProof/>
-            <w:webHidden/>
-            <w:color w:val="auto"/>
-          </w:rPr>
-          <w:tab/>
-          <w:t>6</w:t>
-        </w:r>
-      </w:hyperlink>
+      <w:r>
+        <w:rPr>
+          <w:rFonts w:eastAsiaTheme="majorEastAsia"/>
+          <w:noProof/>
+          <w:color w:val="auto"/>
+        </w:rPr>
+        <w:t>3.2. Thiết kế các hàm và dữ liệu</w:t>
+      </w:r>
+      <w:r>
+        <w:rPr>
+          <w:noProof/>
+          <w:color w:val="auto"/>
+        </w:rPr>
+        <w:tab/>
+        <w:t>6</w:t>
+      </w:r>
     </w:p>
     <w:p>
       <w:pPr>
@@ -2776,25 +2752,22 @@
           <w14:ligatures w14:val="standardContextual"/>
         </w:rPr>
       </w:pPr>
-      <w:hyperlink w:anchor="_Toc243433161" w:history="1">
-        <w:r>
-          <w:rPr>
-            <w:rFonts w:eastAsiaTheme="majorEastAsia"/>
-            <w:noProof/>
-            <w:color w:val="auto"/>
-          </w:rPr>
-          <w:t>3.3. Thuật toán và mã nguồn chính</w:t>
-        </w:r>
-        <w:r>
-          <w:rPr>
-            <w:noProof/>
-            <w:webHidden/>
-            <w:color w:val="auto"/>
-          </w:rPr>
-          <w:tab/>
-          <w:t>7</w:t>
-        </w:r>
-      </w:hyperlink>
+      <w:r>
+        <w:rPr>
+          <w:rFonts w:eastAsiaTheme="majorEastAsia"/>
+          <w:noProof/>
+          <w:color w:val="auto"/>
+        </w:rPr>
+        <w:t>3.3. Thuật toán và mã nguồn chính</w:t>
+      </w:r>
+      <w:r>
+        <w:rPr>
+          <w:noProof/>
+          <w:color w:val="auto"/>
+        </w:rPr>
+        <w:tab/>
+        <w:t>7</w:t>
+      </w:r>
     </w:p>
     <w:p>
       <w:pPr>
@@ -2812,25 +2785,22 @@
           <w14:ligatures w14:val="standardContextual"/>
         </w:rPr>
       </w:pPr>
-      <w:hyperlink w:anchor="_Toc243433162" w:history="1">
-        <w:r>
-          <w:rPr>
-            <w:rFonts w:eastAsiaTheme="majorEastAsia"/>
-            <w:noProof/>
-            <w:color w:val="auto"/>
-          </w:rPr>
-          <w:t>3.4. Lần vết ví dụ nhỏ</w:t>
-        </w:r>
-        <w:r>
-          <w:rPr>
-            <w:noProof/>
-            <w:webHidden/>
-            <w:color w:val="auto"/>
-          </w:rPr>
-          <w:tab/>
-          <w:t>8</w:t>
-        </w:r>
-      </w:hyperlink>
+      <w:r>
+        <w:rPr>
+          <w:rFonts w:eastAsiaTheme="majorEastAsia"/>
+          <w:noProof/>
+          <w:color w:val="auto"/>
+        </w:rPr>
+        <w:t>3.4. Lần vết ví dụ nhỏ</w:t>
+      </w:r>
+      <w:r>
+        <w:rPr>
+          <w:noProof/>
+          <w:color w:val="auto"/>
+        </w:rPr>
+        <w:tab/>
+        <w:t>8</w:t>
+      </w:r>
     </w:p>
     <w:p>
       <w:pPr>
@@ -2848,25 +2818,22 @@
           <w14:ligatures w14:val="standardContextual"/>
         </w:rPr>
       </w:pPr>
-      <w:hyperlink w:anchor="_Toc243433163" w:history="1">
-        <w:r>
-          <w:rPr>
-            <w:rFonts w:eastAsiaTheme="majorEastAsia"/>
-            <w:noProof/>
-            <w:color w:val="auto"/>
-          </w:rPr>
-          <w:t>3.5. Giải thích tính đúng và điều kiện dừng</w:t>
-        </w:r>
-        <w:r>
-          <w:rPr>
-            <w:noProof/>
-            <w:webHidden/>
-            <w:color w:val="auto"/>
-          </w:rPr>
-          <w:tab/>
-          <w:t>9</w:t>
-        </w:r>
-      </w:hyperlink>
+      <w:r>
+        <w:rPr>
+          <w:rFonts w:eastAsiaTheme="majorEastAsia"/>
+          <w:noProof/>
+          <w:color w:val="auto"/>
+        </w:rPr>
+        <w:t>3.5. Giải thích tính đúng và điều kiện dừng</w:t>
+      </w:r>
+      <w:r>
+        <w:rPr>
+          <w:noProof/>
+          <w:color w:val="auto"/>
+        </w:rPr>
+        <w:tab/>
+        <w:t>9</w:t>
+      </w:r>
     </w:p>
     <w:p>
       <w:pPr>
@@ -2884,25 +2851,22 @@
           <w14:ligatures w14:val="standardContextual"/>
         </w:rPr>
       </w:pPr>
-      <w:hyperlink w:anchor="_Toc243433164" w:history="1">
-        <w:r>
-          <w:rPr>
-            <w:rFonts w:eastAsiaTheme="majorEastAsia"/>
-            <w:noProof/>
-            <w:color w:val="auto"/>
-          </w:rPr>
-          <w:t>3.6. Phân tích độ phức tạp</w:t>
-        </w:r>
-        <w:r>
-          <w:rPr>
-            <w:noProof/>
-            <w:webHidden/>
-            <w:color w:val="auto"/>
-          </w:rPr>
-          <w:tab/>
-          <w:t>9</w:t>
-        </w:r>
-      </w:hyperlink>
+      <w:r>
+        <w:rPr>
+          <w:rFonts w:eastAsiaTheme="majorEastAsia"/>
+          <w:noProof/>
+          <w:color w:val="auto"/>
+        </w:rPr>
+        <w:t>3.6. Phân tích độ phức tạp</w:t>
+      </w:r>
+      <w:r>
+        <w:rPr>
+          <w:noProof/>
+          <w:color w:val="auto"/>
+        </w:rPr>
+        <w:tab/>
+        <w:t>10</w:t>
+      </w:r>
     </w:p>
     <w:p>
       <w:pPr>
@@ -2920,25 +2884,22 @@
           <w14:ligatures w14:val="standardContextual"/>
         </w:rPr>
       </w:pPr>
-      <w:hyperlink w:anchor="_Toc243433165" w:history="1">
-        <w:r>
-          <w:rPr>
-            <w:rFonts w:eastAsiaTheme="majorEastAsia"/>
-            <w:noProof/>
-            <w:color w:val="auto"/>
-          </w:rPr>
-          <w:t>CHƯƠNG 4. KẾT QUẢ THỬ NGHIỆM VÀ NHẬN XÉT</w:t>
-        </w:r>
-        <w:r>
-          <w:rPr>
-            <w:noProof/>
-            <w:webHidden/>
-            <w:color w:val="auto"/>
-          </w:rPr>
-          <w:tab/>
-          <w:t>11</w:t>
-        </w:r>
-      </w:hyperlink>
+      <w:r>
+        <w:rPr>
+          <w:rFonts w:eastAsiaTheme="majorEastAsia"/>
+          <w:noProof/>
+          <w:color w:val="auto"/>
+        </w:rPr>
+        <w:t>CHƯƠNG 4. KẾT QUẢ THỬ NGHIỆM VÀ NHẬN XÉT</w:t>
+      </w:r>
+      <w:r>
+        <w:rPr>
+          <w:noProof/>
+          <w:color w:val="auto"/>
+        </w:rPr>
+        <w:tab/>
+        <w:t>11</w:t>
+      </w:r>
     </w:p>
     <w:p>
       <w:pPr>
@@ -2956,25 +2917,22 @@
           <w14:ligatures w14:val="standardContextual"/>
         </w:rPr>
       </w:pPr>
-      <w:hyperlink w:anchor="_Toc243433166" w:history="1">
-        <w:r>
-          <w:rPr>
-            <w:rFonts w:eastAsiaTheme="majorEastAsia"/>
-            <w:noProof/>
-            <w:color w:val="auto"/>
-          </w:rPr>
-          <w:t>4.1. Môi trường và kế hoạch kiểm thử</w:t>
-        </w:r>
-        <w:r>
-          <w:rPr>
-            <w:noProof/>
-            <w:webHidden/>
-            <w:color w:val="auto"/>
-          </w:rPr>
-          <w:tab/>
-          <w:t>11</w:t>
-        </w:r>
-      </w:hyperlink>
+      <w:r>
+        <w:rPr>
+          <w:rFonts w:eastAsiaTheme="majorEastAsia"/>
+          <w:noProof/>
+          <w:color w:val="auto"/>
+        </w:rPr>
+        <w:t>4.1. Môi trường và kế hoạch kiểm thử</w:t>
+      </w:r>
+      <w:r>
+        <w:rPr>
+          <w:noProof/>
+          <w:color w:val="auto"/>
+        </w:rPr>
+        <w:tab/>
+        <w:t>11</w:t>
+      </w:r>
     </w:p>
     <w:p>
       <w:pPr>
@@ -2992,25 +2950,22 @@
           <w14:ligatures w14:val="standardContextual"/>
         </w:rPr>
       </w:pPr>
-      <w:hyperlink w:anchor="_Toc243433167" w:history="1">
-        <w:r>
-          <w:rPr>
-            <w:rFonts w:eastAsiaTheme="majorEastAsia"/>
-            <w:noProof/>
-            <w:color w:val="auto"/>
-          </w:rPr>
-          <w:t>4.2. Bảng kết quả 13 ca</w:t>
-        </w:r>
-        <w:r>
-          <w:rPr>
-            <w:noProof/>
-            <w:webHidden/>
-            <w:color w:val="auto"/>
-          </w:rPr>
-          <w:tab/>
-          <w:t>11</w:t>
-        </w:r>
-      </w:hyperlink>
+      <w:r>
+        <w:rPr>
+          <w:rFonts w:eastAsiaTheme="majorEastAsia"/>
+          <w:noProof/>
+          <w:color w:val="auto"/>
+        </w:rPr>
+        <w:t>4.2. Bảng kết quả 13 ca</w:t>
+      </w:r>
+      <w:r>
+        <w:rPr>
+          <w:noProof/>
+          <w:color w:val="auto"/>
+        </w:rPr>
+        <w:tab/>
+        <w:t>11</w:t>
+      </w:r>
     </w:p>
     <w:p>
       <w:pPr>
@@ -3028,25 +2983,22 @@
           <w14:ligatures w14:val="standardContextual"/>
         </w:rPr>
       </w:pPr>
-      <w:hyperlink w:anchor="_Toc243433168" w:history="1">
-        <w:r>
-          <w:rPr>
-            <w:rFonts w:eastAsiaTheme="majorEastAsia"/>
-            <w:noProof/>
-            <w:color w:val="auto"/>
-          </w:rPr>
-          <w:t>4.3. Hai ví dụ trên phiếu</w:t>
-        </w:r>
-        <w:r>
-          <w:rPr>
-            <w:noProof/>
-            <w:webHidden/>
-            <w:color w:val="auto"/>
-          </w:rPr>
-          <w:tab/>
-          <w:t>14</w:t>
-        </w:r>
-      </w:hyperlink>
+      <w:r>
+        <w:rPr>
+          <w:rFonts w:eastAsiaTheme="majorEastAsia"/>
+          <w:noProof/>
+          <w:color w:val="auto"/>
+        </w:rPr>
+        <w:t>4.3. Hai ví dụ trên phiếu</w:t>
+      </w:r>
+      <w:r>
+        <w:rPr>
+          <w:noProof/>
+          <w:color w:val="auto"/>
+        </w:rPr>
+        <w:tab/>
+        <w:t>14</w:t>
+      </w:r>
     </w:p>
     <w:p>
       <w:pPr>
@@ -3064,25 +3016,22 @@
           <w14:ligatures w14:val="standardContextual"/>
         </w:rPr>
       </w:pPr>
-      <w:hyperlink w:anchor="_Toc243433169" w:history="1">
-        <w:r>
-          <w:rPr>
-            <w:rFonts w:eastAsiaTheme="majorEastAsia"/>
-            <w:noProof/>
-            <w:color w:val="auto"/>
-          </w:rPr>
-          <w:t>4.4. Hai ca sinh viên tự thiết kế</w:t>
-        </w:r>
-        <w:r>
-          <w:rPr>
-            <w:noProof/>
-            <w:webHidden/>
-            <w:color w:val="auto"/>
-          </w:rPr>
-          <w:tab/>
-          <w:t>15</w:t>
-        </w:r>
-      </w:hyperlink>
+      <w:r>
+        <w:rPr>
+          <w:rFonts w:eastAsiaTheme="majorEastAsia"/>
+          <w:noProof/>
+          <w:color w:val="auto"/>
+        </w:rPr>
+        <w:t>4.4. Hai ca sinh viên tự thiết kế</w:t>
+      </w:r>
+      <w:r>
+        <w:rPr>
+          <w:noProof/>
+          <w:color w:val="auto"/>
+        </w:rPr>
+        <w:tab/>
+        <w:t>15</w:t>
+      </w:r>
     </w:p>
     <w:p>
       <w:pPr>
@@ -3100,25 +3049,22 @@
           <w14:ligatures w14:val="standardContextual"/>
         </w:rPr>
       </w:pPr>
-      <w:hyperlink w:anchor="_Toc243433170" w:history="1">
-        <w:r>
-          <w:rPr>
-            <w:rFonts w:eastAsiaTheme="majorEastAsia"/>
-            <w:noProof/>
-            <w:color w:val="auto"/>
-          </w:rPr>
-          <w:t>4.5. Ba ca biên phù hợp với đề tài</w:t>
-        </w:r>
-        <w:r>
-          <w:rPr>
-            <w:noProof/>
-            <w:webHidden/>
-            <w:color w:val="auto"/>
-          </w:rPr>
-          <w:tab/>
-          <w:t>16</w:t>
-        </w:r>
-      </w:hyperlink>
+      <w:r>
+        <w:rPr>
+          <w:rFonts w:eastAsiaTheme="majorEastAsia"/>
+          <w:noProof/>
+          <w:color w:val="auto"/>
+        </w:rPr>
+        <w:t>4.5. Ba ca biên phù hợp với đề tài</w:t>
+      </w:r>
+      <w:r>
+        <w:rPr>
+          <w:noProof/>
+          <w:color w:val="auto"/>
+        </w:rPr>
+        <w:tab/>
+        <w:t>16</w:t>
+      </w:r>
     </w:p>
     <w:p>
       <w:pPr>
@@ -3136,25 +3082,22 @@
           <w14:ligatures w14:val="standardContextual"/>
         </w:rPr>
       </w:pPr>
-      <w:hyperlink w:anchor="_Toc243433171" w:history="1">
-        <w:r>
-          <w:rPr>
-            <w:rFonts w:eastAsiaTheme="majorEastAsia"/>
-            <w:noProof/>
-            <w:color w:val="auto"/>
-          </w:rPr>
-          <w:t>4.6. Kiểm tra input không hợp lệ — LOI01</w:t>
-        </w:r>
-        <w:r>
-          <w:rPr>
-            <w:noProof/>
-            <w:webHidden/>
-            <w:color w:val="auto"/>
-          </w:rPr>
-          <w:tab/>
-          <w:t>17</w:t>
-        </w:r>
-      </w:hyperlink>
+      <w:r>
+        <w:rPr>
+          <w:rFonts w:eastAsiaTheme="majorEastAsia"/>
+          <w:noProof/>
+          <w:color w:val="auto"/>
+        </w:rPr>
+        <w:t>4.6. Kiểm tra input không hợp lệ — LOI01</w:t>
+      </w:r>
+      <w:r>
+        <w:rPr>
+          <w:noProof/>
+          <w:color w:val="auto"/>
+        </w:rPr>
+        <w:tab/>
+        <w:t>17</w:t>
+      </w:r>
     </w:p>
     <w:p>
       <w:pPr>
@@ -3172,25 +3115,22 @@
           <w14:ligatures w14:val="standardContextual"/>
         </w:rPr>
       </w:pPr>
-      <w:hyperlink w:anchor="_Toc243433172" w:history="1">
-        <w:r>
-          <w:rPr>
-            <w:rFonts w:eastAsiaTheme="majorEastAsia"/>
-            <w:noProof/>
-            <w:color w:val="auto"/>
-          </w:rPr>
-          <w:t>4.7. Kết quả toàn bộ kiểm thử</w:t>
-        </w:r>
-        <w:r>
-          <w:rPr>
-            <w:noProof/>
-            <w:webHidden/>
-            <w:color w:val="auto"/>
-          </w:rPr>
-          <w:tab/>
-          <w:t>17</w:t>
-        </w:r>
-      </w:hyperlink>
+      <w:r>
+        <w:rPr>
+          <w:rFonts w:eastAsiaTheme="majorEastAsia"/>
+          <w:noProof/>
+          <w:color w:val="auto"/>
+        </w:rPr>
+        <w:t>4.7. Kết quả toàn bộ kiểm thử</w:t>
+      </w:r>
+      <w:r>
+        <w:rPr>
+          <w:noProof/>
+          <w:color w:val="auto"/>
+        </w:rPr>
+        <w:tab/>
+        <w:t>18</w:t>
+      </w:r>
     </w:p>
     <w:p>
       <w:pPr>
@@ -3208,25 +3148,22 @@
           <w14:ligatures w14:val="standardContextual"/>
         </w:rPr>
       </w:pPr>
-      <w:hyperlink w:anchor="_Toc243433173" w:history="1">
-        <w:r>
-          <w:rPr>
-            <w:rFonts w:eastAsiaTheme="majorEastAsia"/>
-            <w:noProof/>
-            <w:color w:val="auto"/>
-          </w:rPr>
-          <w:t>4.8. Khảo sát bốn quy mô hợp lệ</w:t>
-        </w:r>
-        <w:r>
-          <w:rPr>
-            <w:noProof/>
-            <w:webHidden/>
-            <w:color w:val="auto"/>
-          </w:rPr>
-          <w:tab/>
-          <w:t>18</w:t>
-        </w:r>
-      </w:hyperlink>
+      <w:r>
+        <w:rPr>
+          <w:rFonts w:eastAsiaTheme="majorEastAsia"/>
+          <w:noProof/>
+          <w:color w:val="auto"/>
+        </w:rPr>
+        <w:t>4.8. Khảo sát bốn quy mô hợp lệ</w:t>
+      </w:r>
+      <w:r>
+        <w:rPr>
+          <w:noProof/>
+          <w:color w:val="auto"/>
+        </w:rPr>
+        <w:tab/>
+        <w:t>18</w:t>
+      </w:r>
     </w:p>
     <w:p>
       <w:pPr>
@@ -3244,25 +3181,22 @@
           <w14:ligatures w14:val="standardContextual"/>
         </w:rPr>
       </w:pPr>
-      <w:hyperlink w:anchor="_Toc243433174" w:history="1">
-        <w:r>
-          <w:rPr>
-            <w:rFonts w:eastAsiaTheme="majorEastAsia"/>
-            <w:noProof/>
-            <w:color w:val="auto"/>
-          </w:rPr>
-          <w:t>4.9. GitHub và chạy lại từ bản clone sạch</w:t>
-        </w:r>
-        <w:r>
-          <w:rPr>
-            <w:noProof/>
-            <w:webHidden/>
-            <w:color w:val="auto"/>
-          </w:rPr>
-          <w:tab/>
-          <w:t>20</w:t>
-        </w:r>
-      </w:hyperlink>
+      <w:r>
+        <w:rPr>
+          <w:rFonts w:eastAsiaTheme="majorEastAsia"/>
+          <w:noProof/>
+          <w:color w:val="auto"/>
+        </w:rPr>
+        <w:t>4.9. GitHub và chạy lại từ bản clone sạch</w:t>
+      </w:r>
+      <w:r>
+        <w:rPr>
+          <w:noProof/>
+          <w:color w:val="auto"/>
+        </w:rPr>
+        <w:tab/>
+        <w:t>20</w:t>
+      </w:r>
     </w:p>
     <w:p>
       <w:pPr>
@@ -3280,25 +3214,22 @@
           <w14:ligatures w14:val="standardContextual"/>
         </w:rPr>
       </w:pPr>
-      <w:hyperlink w:anchor="_Toc243433175" w:history="1">
-        <w:r>
-          <w:rPr>
-            <w:rFonts w:eastAsiaTheme="majorEastAsia"/>
-            <w:noProof/>
-            <w:color w:val="auto"/>
-          </w:rPr>
-          <w:t>CHƯƠNG 5. KẾT LUẬN VÀ HƯỚNG PHÁT TRIỂN</w:t>
-        </w:r>
-        <w:r>
-          <w:rPr>
-            <w:noProof/>
-            <w:webHidden/>
-            <w:color w:val="auto"/>
-          </w:rPr>
-          <w:tab/>
-          <w:t>21</w:t>
-        </w:r>
-      </w:hyperlink>
+      <w:r>
+        <w:rPr>
+          <w:rFonts w:eastAsiaTheme="majorEastAsia"/>
+          <w:noProof/>
+          <w:color w:val="auto"/>
+        </w:rPr>
+        <w:t>CHƯƠNG 5. KẾT LUẬN VÀ HƯỚNG PHÁT TRIỂN</w:t>
+      </w:r>
+      <w:r>
+        <w:rPr>
+          <w:noProof/>
+          <w:color w:val="auto"/>
+        </w:rPr>
+        <w:tab/>
+        <w:t>21</w:t>
+      </w:r>
     </w:p>
     <w:p>
       <w:pPr>
@@ -3316,25 +3247,22 @@
           <w14:ligatures w14:val="standardContextual"/>
         </w:rPr>
       </w:pPr>
-      <w:hyperlink w:anchor="_Toc243433176" w:history="1">
-        <w:r>
-          <w:rPr>
-            <w:rFonts w:eastAsiaTheme="majorEastAsia"/>
-            <w:noProof/>
-            <w:color w:val="auto"/>
-          </w:rPr>
-          <w:t>5.1. Mức hoàn thành so với phiếu</w:t>
-        </w:r>
-        <w:r>
-          <w:rPr>
-            <w:noProof/>
-            <w:webHidden/>
-            <w:color w:val="auto"/>
-          </w:rPr>
-          <w:tab/>
-          <w:t>21</w:t>
-        </w:r>
-      </w:hyperlink>
+      <w:r>
+        <w:rPr>
+          <w:rFonts w:eastAsiaTheme="majorEastAsia"/>
+          <w:noProof/>
+          <w:color w:val="auto"/>
+        </w:rPr>
+        <w:t>5.1. Mức hoàn thành so với phiếu</w:t>
+      </w:r>
+      <w:r>
+        <w:rPr>
+          <w:noProof/>
+          <w:color w:val="auto"/>
+        </w:rPr>
+        <w:tab/>
+        <w:t>21</w:t>
+      </w:r>
     </w:p>
     <w:p>
       <w:pPr>
@@ -3352,25 +3280,22 @@
           <w14:ligatures w14:val="standardContextual"/>
         </w:rPr>
       </w:pPr>
-      <w:hyperlink w:anchor="_Toc243433177" w:history="1">
-        <w:r>
-          <w:rPr>
-            <w:rFonts w:eastAsiaTheme="majorEastAsia"/>
-            <w:noProof/>
-            <w:color w:val="auto"/>
-          </w:rPr>
-          <w:t>5.2. Giới hạn và bài học</w:t>
-        </w:r>
-        <w:r>
-          <w:rPr>
-            <w:noProof/>
-            <w:webHidden/>
-            <w:color w:val="auto"/>
-          </w:rPr>
-          <w:tab/>
-          <w:t>21</w:t>
-        </w:r>
-      </w:hyperlink>
+      <w:r>
+        <w:rPr>
+          <w:rFonts w:eastAsiaTheme="majorEastAsia"/>
+          <w:noProof/>
+          <w:color w:val="auto"/>
+        </w:rPr>
+        <w:t>5.2. Giới hạn và bài học</w:t>
+      </w:r>
+      <w:r>
+        <w:rPr>
+          <w:noProof/>
+          <w:color w:val="auto"/>
+        </w:rPr>
+        <w:tab/>
+        <w:t>21</w:t>
+      </w:r>
     </w:p>
     <w:p>
       <w:pPr>
@@ -3388,25 +3313,22 @@
           <w14:ligatures w14:val="standardContextual"/>
         </w:rPr>
       </w:pPr>
-      <w:hyperlink w:anchor="_Toc243433178" w:history="1">
-        <w:r>
-          <w:rPr>
-            <w:rFonts w:eastAsiaTheme="majorEastAsia"/>
-            <w:noProof/>
-            <w:color w:val="auto"/>
-          </w:rPr>
-          <w:t>5.3. Hướng phát triển phù hợp</w:t>
-        </w:r>
-        <w:r>
-          <w:rPr>
-            <w:noProof/>
-            <w:webHidden/>
-            <w:color w:val="auto"/>
-          </w:rPr>
-          <w:tab/>
-          <w:t>21</w:t>
-        </w:r>
-      </w:hyperlink>
+      <w:r>
+        <w:rPr>
+          <w:rFonts w:eastAsiaTheme="majorEastAsia"/>
+          <w:noProof/>
+          <w:color w:val="auto"/>
+        </w:rPr>
+        <w:t>5.3. Hướng phát triển phù hợp</w:t>
+      </w:r>
+      <w:r>
+        <w:rPr>
+          <w:noProof/>
+          <w:color w:val="auto"/>
+        </w:rPr>
+        <w:tab/>
+        <w:t>21</w:t>
+      </w:r>
     </w:p>
     <w:p>
       <w:pPr>
@@ -3424,25 +3346,22 @@
           <w14:ligatures w14:val="standardContextual"/>
         </w:rPr>
       </w:pPr>
-      <w:hyperlink w:anchor="_Toc243433179" w:history="1">
-        <w:r>
-          <w:rPr>
-            <w:rFonts w:eastAsiaTheme="majorEastAsia"/>
-            <w:noProof/>
-            <w:color w:val="auto"/>
-          </w:rPr>
-          <w:t>TÀI LIỆU THAM KHẢO</w:t>
-        </w:r>
-        <w:r>
-          <w:rPr>
-            <w:noProof/>
-            <w:webHidden/>
-            <w:color w:val="auto"/>
-          </w:rPr>
-          <w:tab/>
-          <w:t>22</w:t>
-        </w:r>
-      </w:hyperlink>
+      <w:r>
+        <w:rPr>
+          <w:rFonts w:eastAsiaTheme="majorEastAsia"/>
+          <w:noProof/>
+          <w:color w:val="auto"/>
+        </w:rPr>
+        <w:t>TÀI LIỆU THAM KHẢO</w:t>
+      </w:r>
+      <w:r>
+        <w:rPr>
+          <w:noProof/>
+          <w:color w:val="auto"/>
+        </w:rPr>
+        <w:tab/>
+        <w:t>22</w:t>
+      </w:r>
     </w:p>
     <w:p>
       <w:pPr>
@@ -3460,25 +3379,22 @@
           <w14:ligatures w14:val="standardContextual"/>
         </w:rPr>
       </w:pPr>
-      <w:hyperlink w:anchor="_Toc243433180" w:history="1">
-        <w:r>
-          <w:rPr>
-            <w:rFonts w:eastAsiaTheme="majorEastAsia"/>
-            <w:noProof/>
-            <w:color w:val="auto"/>
-          </w:rPr>
-          <w:t>PHỤ LỤC</w:t>
-        </w:r>
-        <w:r>
-          <w:rPr>
-            <w:noProof/>
-            <w:webHidden/>
-            <w:color w:val="auto"/>
-          </w:rPr>
-          <w:tab/>
-          <w:t>PL-1</w:t>
-        </w:r>
-      </w:hyperlink>
+      <w:r>
+        <w:rPr>
+          <w:rFonts w:eastAsiaTheme="majorEastAsia"/>
+          <w:noProof/>
+          <w:color w:val="auto"/>
+        </w:rPr>
+        <w:t>PHỤ LỤC</w:t>
+      </w:r>
+      <w:r>
+        <w:rPr>
+          <w:noProof/>
+          <w:color w:val="auto"/>
+        </w:rPr>
+        <w:tab/>
+        <w:t>PL-1</w:t>
+      </w:r>
     </w:p>
     <w:p>
       <w:pPr>
@@ -3496,25 +3412,22 @@
           <w14:ligatures w14:val="standardContextual"/>
         </w:rPr>
       </w:pPr>
-      <w:hyperlink w:anchor="_Toc243433181" w:history="1">
-        <w:r>
-          <w:rPr>
-            <w:rFonts w:eastAsiaTheme="majorEastAsia"/>
-            <w:noProof/>
-            <w:color w:val="auto"/>
-          </w:rPr>
-          <w:t>PHỤ LỤC A. Tổ chức mã và hướng dẫn chạy</w:t>
-        </w:r>
-        <w:r>
-          <w:rPr>
-            <w:noProof/>
-            <w:webHidden/>
-            <w:color w:val="auto"/>
-          </w:rPr>
-          <w:tab/>
-          <w:t>PL-1</w:t>
-        </w:r>
-      </w:hyperlink>
+      <w:r>
+        <w:rPr>
+          <w:rFonts w:eastAsiaTheme="majorEastAsia"/>
+          <w:noProof/>
+          <w:color w:val="auto"/>
+        </w:rPr>
+        <w:t>PHỤ LỤC A. Tổ chức mã và hướng dẫn chạy</w:t>
+      </w:r>
+      <w:r>
+        <w:rPr>
+          <w:noProof/>
+          <w:color w:val="auto"/>
+        </w:rPr>
+        <w:tab/>
+        <w:t>PL-1</w:t>
+      </w:r>
     </w:p>
     <w:p>
       <w:pPr>
@@ -3532,25 +3445,22 @@
           <w14:ligatures w14:val="standardContextual"/>
         </w:rPr>
       </w:pPr>
-      <w:hyperlink w:anchor="_Toc243433182" w:history="1">
-        <w:r>
-          <w:rPr>
-            <w:rFonts w:eastAsiaTheme="majorEastAsia"/>
-            <w:noProof/>
-            <w:color w:val="auto"/>
-          </w:rPr>
-          <w:t>PHỤ LỤC B. Danh mục bằng chứng</w:t>
-        </w:r>
-        <w:r>
-          <w:rPr>
-            <w:noProof/>
-            <w:webHidden/>
-            <w:color w:val="auto"/>
-          </w:rPr>
-          <w:tab/>
-          <w:t>PL-2</w:t>
-        </w:r>
-      </w:hyperlink>
+      <w:r>
+        <w:rPr>
+          <w:rFonts w:eastAsiaTheme="majorEastAsia"/>
+          <w:noProof/>
+          <w:color w:val="auto"/>
+        </w:rPr>
+        <w:t>PHỤ LỤC B. Danh mục bằng chứng</w:t>
+      </w:r>
+      <w:r>
+        <w:rPr>
+          <w:noProof/>
+          <w:color w:val="auto"/>
+        </w:rPr>
+        <w:tab/>
+        <w:t>PL-2</w:t>
+      </w:r>
     </w:p>
     <w:p>
       <w:pPr>
@@ -3568,25 +3478,22 @@
           <w14:ligatures w14:val="standardContextual"/>
         </w:rPr>
       </w:pPr>
-      <w:hyperlink w:anchor="_Toc243433183" w:history="1">
-        <w:r>
-          <w:rPr>
-            <w:rFonts w:eastAsiaTheme="majorEastAsia"/>
-            <w:noProof/>
-            <w:color w:val="auto"/>
-          </w:rPr>
-          <w:t>PHỤ LỤC C. Tự kiểm trước khi nộp</w:t>
-        </w:r>
-        <w:r>
-          <w:rPr>
-            <w:noProof/>
-            <w:webHidden/>
-            <w:color w:val="auto"/>
-          </w:rPr>
-          <w:tab/>
-          <w:t>PL-3</w:t>
-        </w:r>
-      </w:hyperlink>
+      <w:r>
+        <w:rPr>
+          <w:rFonts w:eastAsiaTheme="majorEastAsia"/>
+          <w:noProof/>
+          <w:color w:val="auto"/>
+        </w:rPr>
+        <w:t>PHỤ LỤC C. Tự kiểm trước khi nộp</w:t>
+      </w:r>
+      <w:r>
+        <w:rPr>
+          <w:noProof/>
+          <w:color w:val="auto"/>
+        </w:rPr>
+        <w:tab/>
+        <w:t>PL-3</w:t>
+      </w:r>
     </w:p>
     <w:p>
       <w:pPr>
@@ -3604,39 +3511,36 @@
           <w14:ligatures w14:val="standardContextual"/>
         </w:rPr>
       </w:pPr>
-      <w:hyperlink w:anchor="_Toc243433184" w:history="1">
-        <w:r>
-          <w:rPr>
-            <w:rFonts w:eastAsiaTheme="majorEastAsia"/>
-            <w:noProof/>
-            <w:color w:val="auto"/>
-          </w:rPr>
-          <w:t>PHỤ LỤC D HƯỚNG DẪN NỘP CLASSROOM</w:t>
-        </w:r>
-        <w:r>
-          <w:rPr>
-            <w:noProof/>
-            <w:webHidden/>
-            <w:color w:val="auto"/>
-          </w:rPr>
-          <w:tab/>
-          <w:t>PL-4</w:t>
-        </w:r>
-      </w:hyperlink>
+      <w:r>
+        <w:rPr>
+          <w:rFonts w:eastAsiaTheme="majorEastAsia"/>
+          <w:noProof/>
+          <w:color w:val="auto"/>
+        </w:rPr>
+        <w:t>PHỤ LỤC D HƯỚNG DẪN NỘP CLASSROOM</w:t>
+      </w:r>
+      <w:r>
+        <w:rPr>
+          <w:noProof/>
+          <w:color w:val="auto"/>
+        </w:rPr>
+        <w:tab/>
+        <w:t>PL-4</w:t>
+      </w:r>
     </w:p>
     <w:p>
       <w:r>
         <w:rPr>
           <w:sz w:val="24"/>
         </w:rPr>
-        <w:t>PHỤ LỤC E — ẢNH MINH CHỨNG A10 VÀ A11</w:t>
+        <w:t>PHỤ LỤC E — HAI ẢNH A10 VÀ A11</w:t>
+        <w:tab/>
+        <w:t>PL-6</w:t>
       </w:r>
       <w:r>
         <w:rPr>
           <w:sz w:val="24"/>
         </w:rPr>
-        <w:tab/>
-        <w:t>PL-5</w:t>
       </w:r>
     </w:p>
     <w:p/>
@@ -3803,6 +3707,9 @@
         </w:tc>
       </w:tr>
       <w:tr>
+        <w:trPr>
+          <w:cantSplit/>
+        </w:trPr>
         <w:tc>
           <w:tcPr>
             <w:tcW w:w="3402" w:type="dxa"/>
@@ -3825,6 +3732,9 @@
         </w:tc>
       </w:tr>
       <w:tr>
+        <w:trPr>
+          <w:cantSplit/>
+        </w:trPr>
         <w:tc>
           <w:tcPr>
             <w:tcW w:w="3402" w:type="dxa"/>
@@ -3847,6 +3757,9 @@
         </w:tc>
       </w:tr>
       <w:tr>
+        <w:trPr>
+          <w:cantSplit/>
+        </w:trPr>
         <w:tc>
           <w:tcPr>
             <w:tcW w:w="3402" w:type="dxa"/>
@@ -3869,6 +3782,9 @@
         </w:tc>
       </w:tr>
       <w:tr>
+        <w:trPr>
+          <w:cantSplit/>
+        </w:trPr>
         <w:tc>
           <w:tcPr>
             <w:tcW w:w="3402" w:type="dxa"/>
@@ -3891,6 +3807,9 @@
         </w:tc>
       </w:tr>
       <w:tr>
+        <w:trPr>
+          <w:cantSplit/>
+        </w:trPr>
         <w:tc>
           <w:tcPr>
             <w:tcW w:w="3402" w:type="dxa"/>
@@ -3913,6 +3832,9 @@
         </w:tc>
       </w:tr>
       <w:tr>
+        <w:trPr>
+          <w:cantSplit/>
+        </w:trPr>
         <w:tc>
           <w:tcPr>
             <w:tcW w:w="3402" w:type="dxa"/>
@@ -3935,6 +3857,9 @@
         </w:tc>
       </w:tr>
       <w:tr>
+        <w:trPr>
+          <w:cantSplit/>
+        </w:trPr>
         <w:tc>
           <w:tcPr>
             <w:tcW w:w="3402" w:type="dxa"/>
@@ -3957,6 +3882,9 @@
         </w:tc>
       </w:tr>
       <w:tr>
+        <w:trPr>
+          <w:cantSplit/>
+        </w:trPr>
         <w:tc>
           <w:tcPr>
             <w:tcW w:w="3402" w:type="dxa"/>
@@ -3979,6 +3907,9 @@
         </w:tc>
       </w:tr>
       <w:tr>
+        <w:trPr>
+          <w:cantSplit/>
+        </w:trPr>
         <w:tc>
           <w:tcPr>
             <w:tcW w:w="3402" w:type="dxa"/>
@@ -4001,6 +3932,9 @@
         </w:tc>
       </w:tr>
       <w:tr>
+        <w:trPr>
+          <w:cantSplit/>
+        </w:trPr>
         <w:tc>
           <w:tcPr>
             <w:tcW w:w="3402" w:type="dxa"/>
@@ -4074,25 +4008,22 @@
           <w14:ligatures w14:val="standardContextual"/>
         </w:rPr>
       </w:pPr>
-      <w:hyperlink w:anchor="_Toc243433185" w:history="1">
-        <w:r>
-          <w:rPr>
-            <w:rFonts w:eastAsiaTheme="majorEastAsia"/>
-            <w:noProof/>
-            <w:color w:val="auto"/>
-          </w:rPr>
-          <w:t>Bảng 1.1 Đặc tả dữ liệu vào</w:t>
-        </w:r>
-        <w:r>
-          <w:rPr>
-            <w:noProof/>
-            <w:webHidden/>
-            <w:color w:val="auto"/>
-          </w:rPr>
-          <w:tab/>
-          <w:t>2</w:t>
-        </w:r>
-      </w:hyperlink>
+      <w:r>
+        <w:rPr>
+          <w:rFonts w:eastAsiaTheme="majorEastAsia"/>
+          <w:noProof/>
+          <w:color w:val="auto"/>
+        </w:rPr>
+        <w:t>Bảng 1.1 Đặc tả dữ liệu vào</w:t>
+      </w:r>
+      <w:r>
+        <w:rPr>
+          <w:noProof/>
+          <w:color w:val="auto"/>
+        </w:rPr>
+        <w:tab/>
+        <w:t>2</w:t>
+      </w:r>
     </w:p>
     <w:p>
       <w:pPr>
@@ -4110,25 +4041,22 @@
           <w14:ligatures w14:val="standardContextual"/>
         </w:rPr>
       </w:pPr>
-      <w:hyperlink w:anchor="_Toc243433186" w:history="1">
-        <w:r>
-          <w:rPr>
-            <w:rFonts w:eastAsiaTheme="majorEastAsia"/>
-            <w:noProof/>
-            <w:color w:val="auto"/>
-          </w:rPr>
-          <w:t>Bảng 1.2 Đặc tả kết quả đầu ra</w:t>
-        </w:r>
-        <w:r>
-          <w:rPr>
-            <w:noProof/>
-            <w:webHidden/>
-            <w:color w:val="auto"/>
-          </w:rPr>
-          <w:tab/>
-          <w:t>2</w:t>
-        </w:r>
-      </w:hyperlink>
+      <w:r>
+        <w:rPr>
+          <w:rFonts w:eastAsiaTheme="majorEastAsia"/>
+          <w:noProof/>
+          <w:color w:val="auto"/>
+        </w:rPr>
+        <w:t>Bảng 1.2 Đặc tả kết quả đầu ra</w:t>
+      </w:r>
+      <w:r>
+        <w:rPr>
+          <w:noProof/>
+          <w:color w:val="auto"/>
+        </w:rPr>
+        <w:tab/>
+        <w:t>2</w:t>
+      </w:r>
     </w:p>
     <w:p>
       <w:pPr>
@@ -4146,25 +4074,22 @@
           <w14:ligatures w14:val="standardContextual"/>
         </w:rPr>
       </w:pPr>
-      <w:hyperlink w:anchor="_Toc243433187" w:history="1">
-        <w:r>
-          <w:rPr>
-            <w:rFonts w:eastAsiaTheme="majorEastAsia"/>
-            <w:noProof/>
-            <w:color w:val="auto"/>
-          </w:rPr>
-          <w:t>Bảng 1.3 Đối chiếu yêu cầu và sản phẩm</w:t>
-        </w:r>
-        <w:r>
-          <w:rPr>
-            <w:noProof/>
-            <w:webHidden/>
-            <w:color w:val="auto"/>
-          </w:rPr>
-          <w:tab/>
-          <w:t>2</w:t>
-        </w:r>
-      </w:hyperlink>
+      <w:r>
+        <w:rPr>
+          <w:rFonts w:eastAsiaTheme="majorEastAsia"/>
+          <w:noProof/>
+          <w:color w:val="auto"/>
+        </w:rPr>
+        <w:t>Bảng 1.3 Đối chiếu yêu cầu và sản phẩm</w:t>
+      </w:r>
+      <w:r>
+        <w:rPr>
+          <w:noProof/>
+          <w:color w:val="auto"/>
+        </w:rPr>
+        <w:tab/>
+        <w:t>3</w:t>
+      </w:r>
     </w:p>
     <w:p>
       <w:pPr>
@@ -4182,25 +4107,22 @@
           <w14:ligatures w14:val="standardContextual"/>
         </w:rPr>
       </w:pPr>
-      <w:hyperlink w:anchor="_Toc243433188" w:history="1">
-        <w:r>
-          <w:rPr>
-            <w:rFonts w:eastAsiaTheme="majorEastAsia"/>
-            <w:noProof/>
-            <w:color w:val="auto"/>
-          </w:rPr>
-          <w:t>Bảng 2.1 Biến cấu trúc và điều kiện phải duy trì</w:t>
-        </w:r>
-        <w:r>
-          <w:rPr>
-            <w:noProof/>
-            <w:webHidden/>
-            <w:color w:val="auto"/>
-          </w:rPr>
-          <w:tab/>
-          <w:t>4</w:t>
-        </w:r>
-      </w:hyperlink>
+      <w:r>
+        <w:rPr>
+          <w:rFonts w:eastAsiaTheme="majorEastAsia"/>
+          <w:noProof/>
+          <w:color w:val="auto"/>
+        </w:rPr>
+        <w:t>Bảng 2.1 Biến cấu trúc và điều kiện phải duy trì</w:t>
+      </w:r>
+      <w:r>
+        <w:rPr>
+          <w:noProof/>
+          <w:color w:val="auto"/>
+        </w:rPr>
+        <w:tab/>
+        <w:t>4</w:t>
+      </w:r>
     </w:p>
     <w:p>
       <w:pPr>
@@ -4218,25 +4140,22 @@
           <w14:ligatures w14:val="standardContextual"/>
         </w:rPr>
       </w:pPr>
-      <w:hyperlink w:anchor="_Toc243433189" w:history="1">
-        <w:r>
-          <w:rPr>
-            <w:rFonts w:eastAsiaTheme="majorEastAsia"/>
-            <w:noProof/>
-            <w:color w:val="auto"/>
-          </w:rPr>
-          <w:t>Bảng 3.1 Tổ chức các hàm và tệp</w:t>
-        </w:r>
-        <w:r>
-          <w:rPr>
-            <w:noProof/>
-            <w:webHidden/>
-            <w:color w:val="auto"/>
-          </w:rPr>
-          <w:tab/>
-          <w:t>6</w:t>
-        </w:r>
-      </w:hyperlink>
+      <w:r>
+        <w:rPr>
+          <w:rFonts w:eastAsiaTheme="majorEastAsia"/>
+          <w:noProof/>
+          <w:color w:val="auto"/>
+        </w:rPr>
+        <w:t>Bảng 3.1 Tổ chức các hàm và tệp</w:t>
+      </w:r>
+      <w:r>
+        <w:rPr>
+          <w:noProof/>
+          <w:color w:val="auto"/>
+        </w:rPr>
+        <w:tab/>
+        <w:t>7</w:t>
+      </w:r>
     </w:p>
     <w:p>
       <w:pPr>
@@ -4254,25 +4173,22 @@
           <w14:ligatures w14:val="standardContextual"/>
         </w:rPr>
       </w:pPr>
-      <w:hyperlink w:anchor="_Toc243433190" w:history="1">
-        <w:r>
-          <w:rPr>
-            <w:rFonts w:eastAsiaTheme="majorEastAsia"/>
-            <w:noProof/>
-            <w:color w:val="auto"/>
-          </w:rPr>
-          <w:t>Bảng 3.2 Tiền điều kiện và hậu điều kiện của các hàm</w:t>
-        </w:r>
-        <w:r>
-          <w:rPr>
-            <w:noProof/>
-            <w:webHidden/>
-            <w:color w:val="auto"/>
-          </w:rPr>
-          <w:tab/>
-          <w:t>7</w:t>
-        </w:r>
-      </w:hyperlink>
+      <w:r>
+        <w:rPr>
+          <w:rFonts w:eastAsiaTheme="majorEastAsia"/>
+          <w:noProof/>
+          <w:color w:val="auto"/>
+        </w:rPr>
+        <w:t>Bảng 3.2 Tiền điều kiện và hậu điều kiện của các hàm</w:t>
+      </w:r>
+      <w:r>
+        <w:rPr>
+          <w:noProof/>
+          <w:color w:val="auto"/>
+        </w:rPr>
+        <w:tab/>
+        <w:t>7</w:t>
+      </w:r>
     </w:p>
     <w:p>
       <w:pPr>
@@ -4290,25 +4206,22 @@
           <w14:ligatures w14:val="standardContextual"/>
         </w:rPr>
       </w:pPr>
-      <w:hyperlink w:anchor="_Toc243433191" w:history="1">
-        <w:r>
-          <w:rPr>
-            <w:rFonts w:eastAsiaTheme="majorEastAsia"/>
-            <w:noProof/>
-            <w:color w:val="auto"/>
-          </w:rPr>
-          <w:t>Bảng 3.3 Truy vết ca</w:t>
-        </w:r>
-        <w:r>
-          <w:rPr>
-            <w:noProof/>
-            <w:webHidden/>
-            <w:color w:val="auto"/>
-          </w:rPr>
-          <w:tab/>
-          <w:t>8</w:t>
-        </w:r>
-      </w:hyperlink>
+      <w:r>
+        <w:rPr>
+          <w:rFonts w:eastAsiaTheme="majorEastAsia"/>
+          <w:noProof/>
+          <w:color w:val="auto"/>
+        </w:rPr>
+        <w:t>Bảng 3.3 Truy vết ca</w:t>
+      </w:r>
+      <w:r>
+        <w:rPr>
+          <w:noProof/>
+          <w:color w:val="auto"/>
+        </w:rPr>
+        <w:tab/>
+        <w:t>8</w:t>
+      </w:r>
     </w:p>
     <w:p>
       <w:pPr>
@@ -4326,25 +4239,22 @@
           <w14:ligatures w14:val="standardContextual"/>
         </w:rPr>
       </w:pPr>
-      <w:hyperlink w:anchor="_Toc243433192" w:history="1">
-        <w:r>
-          <w:rPr>
-            <w:rFonts w:eastAsiaTheme="majorEastAsia"/>
-            <w:noProof/>
-            <w:color w:val="auto"/>
-          </w:rPr>
-          <w:t>Bảng 3.4 Chi phí của từng pha trong bản cài</w:t>
-        </w:r>
-        <w:r>
-          <w:rPr>
-            <w:noProof/>
-            <w:webHidden/>
-            <w:color w:val="auto"/>
-          </w:rPr>
-          <w:tab/>
-          <w:t>10</w:t>
-        </w:r>
-      </w:hyperlink>
+      <w:r>
+        <w:rPr>
+          <w:rFonts w:eastAsiaTheme="majorEastAsia"/>
+          <w:noProof/>
+          <w:color w:val="auto"/>
+        </w:rPr>
+        <w:t>Bảng 3.4 Chi phí của từng pha trong bản cài</w:t>
+      </w:r>
+      <w:r>
+        <w:rPr>
+          <w:noProof/>
+          <w:color w:val="auto"/>
+        </w:rPr>
+        <w:tab/>
+        <w:t>10</w:t>
+      </w:r>
     </w:p>
     <w:p>
       <w:pPr>
@@ -4362,25 +4272,22 @@
           <w14:ligatures w14:val="standardContextual"/>
         </w:rPr>
       </w:pPr>
-      <w:hyperlink w:anchor="_Toc243433193" w:history="1">
-        <w:r>
-          <w:rPr>
-            <w:rFonts w:eastAsiaTheme="majorEastAsia"/>
-            <w:noProof/>
-            <w:color w:val="auto"/>
-          </w:rPr>
-          <w:t>Bảng 4.1 Ánh xạ năm ca kiểm trên phiếu</w:t>
-        </w:r>
-        <w:r>
-          <w:rPr>
-            <w:noProof/>
-            <w:webHidden/>
-            <w:color w:val="auto"/>
-          </w:rPr>
-          <w:tab/>
-          <w:t>11</w:t>
-        </w:r>
-      </w:hyperlink>
+      <w:r>
+        <w:rPr>
+          <w:rFonts w:eastAsiaTheme="majorEastAsia"/>
+          <w:noProof/>
+          <w:color w:val="auto"/>
+        </w:rPr>
+        <w:t>Bảng 4.1 Ánh xạ năm ca kiểm trên phiếu</w:t>
+      </w:r>
+      <w:r>
+        <w:rPr>
+          <w:noProof/>
+          <w:color w:val="auto"/>
+        </w:rPr>
+        <w:tab/>
+        <w:t>11</w:t>
+      </w:r>
     </w:p>
     <w:p>
       <w:pPr>
@@ -4398,25 +4305,22 @@
           <w14:ligatures w14:val="standardContextual"/>
         </w:rPr>
       </w:pPr>
-      <w:hyperlink w:anchor="_Toc243433194" w:history="1">
-        <w:r>
-          <w:rPr>
-            <w:rFonts w:eastAsiaTheme="majorEastAsia"/>
-            <w:noProof/>
-            <w:color w:val="auto"/>
-          </w:rPr>
-          <w:t>Bảng 4.2 Thiết kế 13 ca kiểm độc lập</w:t>
-        </w:r>
-        <w:r>
-          <w:rPr>
-            <w:noProof/>
-            <w:webHidden/>
-            <w:color w:val="auto"/>
-          </w:rPr>
-          <w:tab/>
-          <w:t>12</w:t>
-        </w:r>
-      </w:hyperlink>
+      <w:r>
+        <w:rPr>
+          <w:rFonts w:eastAsiaTheme="majorEastAsia"/>
+          <w:noProof/>
+          <w:color w:val="auto"/>
+        </w:rPr>
+        <w:t>Bảng 4.2 Thiết kế 13 ca kiểm độc lập</w:t>
+      </w:r>
+      <w:r>
+        <w:rPr>
+          <w:noProof/>
+          <w:color w:val="auto"/>
+        </w:rPr>
+        <w:tab/>
+        <w:t>12</w:t>
+      </w:r>
     </w:p>
     <w:p>
       <w:pPr>
@@ -4434,25 +4338,22 @@
           <w14:ligatures w14:val="standardContextual"/>
         </w:rPr>
       </w:pPr>
-      <w:hyperlink w:anchor="_Toc243433195" w:history="1">
-        <w:r>
-          <w:rPr>
-            <w:rFonts w:eastAsiaTheme="majorEastAsia"/>
-            <w:noProof/>
-            <w:color w:val="auto"/>
-          </w:rPr>
-          <w:t>Bảng 4.3 Actual kết luận và vị trí minh chứng</w:t>
-        </w:r>
-        <w:r>
-          <w:rPr>
-            <w:noProof/>
-            <w:webHidden/>
-            <w:color w:val="auto"/>
-          </w:rPr>
-          <w:tab/>
-          <w:t>13</w:t>
-        </w:r>
-      </w:hyperlink>
+      <w:r>
+        <w:rPr>
+          <w:rFonts w:eastAsiaTheme="majorEastAsia"/>
+          <w:noProof/>
+          <w:color w:val="auto"/>
+        </w:rPr>
+        <w:t>Bảng 4.3 Actual kết luận và vị trí minh chứng</w:t>
+      </w:r>
+      <w:r>
+        <w:rPr>
+          <w:noProof/>
+          <w:color w:val="auto"/>
+        </w:rPr>
+        <w:tab/>
+        <w:t>13</w:t>
+      </w:r>
     </w:p>
     <w:p>
       <w:pPr>
@@ -4470,25 +4371,22 @@
           <w14:ligatures w14:val="standardContextual"/>
         </w:rPr>
       </w:pPr>
-      <w:hyperlink w:anchor="_Toc243433196" w:history="1">
-        <w:r>
-          <w:rPr>
-            <w:rFonts w:eastAsiaTheme="majorEastAsia"/>
-            <w:noProof/>
-            <w:color w:val="auto"/>
-          </w:rPr>
-          <w:t>Bảng 4.4 Khảo sát Q1–Q4</w:t>
-        </w:r>
-        <w:r>
-          <w:rPr>
-            <w:noProof/>
-            <w:webHidden/>
-            <w:color w:val="auto"/>
-          </w:rPr>
-          <w:tab/>
-          <w:t>18</w:t>
-        </w:r>
-      </w:hyperlink>
+      <w:r>
+        <w:rPr>
+          <w:rFonts w:eastAsiaTheme="majorEastAsia"/>
+          <w:noProof/>
+          <w:color w:val="auto"/>
+        </w:rPr>
+        <w:t>Bảng 4.4 Khảo sát Q1–Q4</w:t>
+      </w:r>
+      <w:r>
+        <w:rPr>
+          <w:noProof/>
+          <w:color w:val="auto"/>
+        </w:rPr>
+        <w:tab/>
+        <w:t>19</w:t>
+      </w:r>
     </w:p>
     <w:p>
       <w:pPr>
@@ -4506,25 +4404,22 @@
           <w14:ligatures w14:val="standardContextual"/>
         </w:rPr>
       </w:pPr>
-      <w:hyperlink w:anchor="_Toc243433197" w:history="1">
-        <w:r>
-          <w:rPr>
-            <w:rFonts w:eastAsiaTheme="majorEastAsia"/>
-            <w:noProof/>
-            <w:color w:val="auto"/>
-          </w:rPr>
-          <w:t>Bảng 4.5 Kho mã và phiên bản có thể kiểm lại</w:t>
-        </w:r>
-        <w:r>
-          <w:rPr>
-            <w:noProof/>
-            <w:webHidden/>
-            <w:color w:val="auto"/>
-          </w:rPr>
-          <w:tab/>
-          <w:t>20</w:t>
-        </w:r>
-      </w:hyperlink>
+      <w:r>
+        <w:rPr>
+          <w:rFonts w:eastAsiaTheme="majorEastAsia"/>
+          <w:noProof/>
+          <w:color w:val="auto"/>
+        </w:rPr>
+        <w:t>Bảng 4.5 Kho mã và phiên bản có thể kiểm lại</w:t>
+      </w:r>
+      <w:r>
+        <w:rPr>
+          <w:noProof/>
+          <w:color w:val="auto"/>
+        </w:rPr>
+        <w:tab/>
+        <w:t>20</w:t>
+      </w:r>
     </w:p>
     <w:p>
       <w:pPr>
@@ -4542,25 +4437,22 @@
           <w14:ligatures w14:val="standardContextual"/>
         </w:rPr>
       </w:pPr>
-      <w:hyperlink w:anchor="_Toc243433198" w:history="1">
-        <w:r>
-          <w:rPr>
-            <w:rFonts w:eastAsiaTheme="majorEastAsia"/>
-            <w:noProof/>
-            <w:color w:val="auto"/>
-          </w:rPr>
-          <w:t>Bảng 5.1 Mức hoàn thành và bằng chứng theo yêu cầu</w:t>
-        </w:r>
-        <w:r>
-          <w:rPr>
-            <w:noProof/>
-            <w:webHidden/>
-            <w:color w:val="auto"/>
-          </w:rPr>
-          <w:tab/>
-          <w:t>21</w:t>
-        </w:r>
-      </w:hyperlink>
+      <w:r>
+        <w:rPr>
+          <w:rFonts w:eastAsiaTheme="majorEastAsia"/>
+          <w:noProof/>
+          <w:color w:val="auto"/>
+        </w:rPr>
+        <w:t>Bảng 5.1 Mức hoàn thành và bằng chứng theo yêu cầu</w:t>
+      </w:r>
+      <w:r>
+        <w:rPr>
+          <w:noProof/>
+          <w:color w:val="auto"/>
+        </w:rPr>
+        <w:tab/>
+        <w:t>21</w:t>
+      </w:r>
     </w:p>
     <w:p>
       <w:pPr>
@@ -4578,25 +4470,22 @@
           <w14:ligatures w14:val="standardContextual"/>
         </w:rPr>
       </w:pPr>
-      <w:hyperlink w:anchor="_Toc243433199" w:history="1">
-        <w:r>
-          <w:rPr>
-            <w:rFonts w:eastAsiaTheme="majorEastAsia"/>
-            <w:noProof/>
-            <w:color w:val="auto"/>
-          </w:rPr>
-          <w:t>Bảng PL.1 Bốn tệp cần nộp</w:t>
-        </w:r>
-        <w:r>
-          <w:rPr>
-            <w:noProof/>
-            <w:webHidden/>
-            <w:color w:val="auto"/>
-          </w:rPr>
-          <w:tab/>
-          <w:t>PL-4</w:t>
-        </w:r>
-      </w:hyperlink>
+      <w:r>
+        <w:rPr>
+          <w:rFonts w:eastAsiaTheme="majorEastAsia"/>
+          <w:noProof/>
+          <w:color w:val="auto"/>
+        </w:rPr>
+        <w:t>Bảng PL.1 Bốn tệp cần nộp</w:t>
+      </w:r>
+      <w:r>
+        <w:rPr>
+          <w:noProof/>
+          <w:color w:val="auto"/>
+        </w:rPr>
+        <w:tab/>
+        <w:t>PL-4</w:t>
+      </w:r>
     </w:p>
     <w:p/>
     <w:p>
@@ -4642,25 +4531,26 @@
           <w14:ligatures w14:val="standardContextual"/>
         </w:rPr>
       </w:pPr>
-      <w:hyperlink w:anchor="_Toc243433200" w:history="1">
-        <w:r>
-          <w:rPr>
-            <w:rFonts w:eastAsiaTheme="majorEastAsia"/>
-            <w:noProof/>
-            <w:color w:val="auto"/>
-          </w:rPr>
-          <w:t>Hình 4.1 — Ví dụ 1 (VD01): output thật từ demo.jl --ca=1 trong VS Code.</w:t>
-        </w:r>
-        <w:r>
-          <w:rPr>
-            <w:noProof/>
-            <w:webHidden/>
-            <w:color w:val="auto"/>
-          </w:rPr>
-          <w:tab/>
-          <w:t>14</w:t>
-        </w:r>
-      </w:hyperlink>
+      <w:r>
+        <w:rPr>
+          <w:rFonts w:eastAsiaTheme="majorEastAsia"/>
+          <w:noProof/>
+          <w:color w:val="auto"/>
+        </w:rPr>
+        <w:t/>
+      </w:r>
+      <w:r>
+        <w:rPr>
+          <w:noProof/>
+          <w:color w:val="auto"/>
+        </w:rPr>
+        <w:t/>
+      </w:r>
+      <w:r>
+        <w:t>Hình 4.1 — VD01: kết quả in ra từ demo.jl --ca=1, chụp trong VS Code.</w:t>
+        <w:tab/>
+        <w:t>14</w:t>
+      </w:r>
     </w:p>
     <w:p>
       <w:pPr>
@@ -4678,25 +4568,26 @@
           <w14:ligatures w14:val="standardContextual"/>
         </w:rPr>
       </w:pPr>
-      <w:hyperlink w:anchor="_Toc243433201" w:history="1">
-        <w:r>
-          <w:rPr>
-            <w:rFonts w:eastAsiaTheme="majorEastAsia"/>
-            <w:noProof/>
-            <w:color w:val="auto"/>
-          </w:rPr>
-          <w:t>Hình 4.2 — Ví dụ 2 (VD02): x vắng mặt, không nhận vị trí chèn.</w:t>
-        </w:r>
-        <w:r>
-          <w:rPr>
-            <w:noProof/>
-            <w:webHidden/>
-            <w:color w:val="auto"/>
-          </w:rPr>
-          <w:tab/>
-          <w:t>14</w:t>
-        </w:r>
-      </w:hyperlink>
+      <w:r>
+        <w:rPr>
+          <w:rFonts w:eastAsiaTheme="majorEastAsia"/>
+          <w:noProof/>
+          <w:color w:val="auto"/>
+        </w:rPr>
+        <w:t/>
+      </w:r>
+      <w:r>
+        <w:rPr>
+          <w:noProof/>
+          <w:color w:val="auto"/>
+        </w:rPr>
+        <w:t/>
+      </w:r>
+      <w:r>
+        <w:t>Hình 4.2 — VD02: x vắng mặt nên kết quả là 0, 0, 0.</w:t>
+        <w:tab/>
+        <w:t>14</w:t>
+      </w:r>
     </w:p>
     <w:p>
       <w:pPr>
@@ -4714,25 +4605,26 @@
           <w14:ligatures w14:val="standardContextual"/>
         </w:rPr>
       </w:pPr>
-      <w:hyperlink w:anchor="_Toc243433202" w:history="1">
-        <w:r>
-          <w:rPr>
-            <w:rFonts w:eastAsiaTheme="majorEastAsia"/>
-            <w:noProof/>
-            <w:color w:val="auto"/>
-          </w:rPr>
-          <w:t>Hình 4.3 — Ca tự thiết kế 1 (TK01): x ở đầu mảng.</w:t>
-        </w:r>
-        <w:r>
-          <w:rPr>
-            <w:noProof/>
-            <w:webHidden/>
-            <w:color w:val="auto"/>
-          </w:rPr>
-          <w:tab/>
-          <w:t>15</w:t>
-        </w:r>
-      </w:hyperlink>
+      <w:r>
+        <w:rPr>
+          <w:rFonts w:eastAsiaTheme="majorEastAsia"/>
+          <w:noProof/>
+          <w:color w:val="auto"/>
+        </w:rPr>
+        <w:t/>
+      </w:r>
+      <w:r>
+        <w:rPr>
+          <w:noProof/>
+          <w:color w:val="auto"/>
+        </w:rPr>
+        <w:t/>
+      </w:r>
+      <w:r>
+        <w:t>Hình 4.3 — TK01: x nằm ở đầu mảng.</w:t>
+        <w:tab/>
+        <w:t>15</w:t>
+      </w:r>
     </w:p>
     <w:p>
       <w:pPr>
@@ -4750,25 +4642,26 @@
           <w14:ligatures w14:val="standardContextual"/>
         </w:rPr>
       </w:pPr>
-      <w:hyperlink w:anchor="_Toc243433203" w:history="1">
-        <w:r>
-          <w:rPr>
-            <w:rFonts w:eastAsiaTheme="majorEastAsia"/>
-            <w:noProof/>
-            <w:color w:val="auto"/>
-          </w:rPr>
-          <w:t>Hình 4.4 — Ca tự thiết kế 2 (TK02): x ở cuối mảng.</w:t>
-        </w:r>
-        <w:r>
-          <w:rPr>
-            <w:noProof/>
-            <w:webHidden/>
-            <w:color w:val="auto"/>
-          </w:rPr>
-          <w:tab/>
-          <w:t>15</w:t>
-        </w:r>
-      </w:hyperlink>
+      <w:r>
+        <w:rPr>
+          <w:rFonts w:eastAsiaTheme="majorEastAsia"/>
+          <w:noProof/>
+          <w:color w:val="auto"/>
+        </w:rPr>
+        <w:t/>
+      </w:r>
+      <w:r>
+        <w:rPr>
+          <w:noProof/>
+          <w:color w:val="auto"/>
+        </w:rPr>
+        <w:t/>
+      </w:r>
+      <w:r>
+        <w:t>Hình 4.4 — TK02: x nằm ở cuối mảng.</w:t>
+        <w:tab/>
+        <w:t>15</w:t>
+      </w:r>
     </w:p>
     <w:p>
       <w:pPr>
@@ -4786,25 +4679,26 @@
           <w14:ligatures w14:val="standardContextual"/>
         </w:rPr>
       </w:pPr>
-      <w:hyperlink w:anchor="_Toc243433204" w:history="1">
-        <w:r>
-          <w:rPr>
-            <w:rFonts w:eastAsiaTheme="majorEastAsia"/>
-            <w:noProof/>
-            <w:color w:val="auto"/>
-          </w:rPr>
-          <w:t>Hình 4.5 — Biên 1 (BIEN01): mảng hai phần tử.</w:t>
-        </w:r>
-        <w:r>
-          <w:rPr>
-            <w:noProof/>
-            <w:webHidden/>
-            <w:color w:val="auto"/>
-          </w:rPr>
-          <w:tab/>
-          <w:t>16</w:t>
-        </w:r>
-      </w:hyperlink>
+      <w:r>
+        <w:rPr>
+          <w:rFonts w:eastAsiaTheme="majorEastAsia"/>
+          <w:noProof/>
+          <w:color w:val="auto"/>
+        </w:rPr>
+        <w:t/>
+      </w:r>
+      <w:r>
+        <w:rPr>
+          <w:noProof/>
+          <w:color w:val="auto"/>
+        </w:rPr>
+        <w:t/>
+      </w:r>
+      <w:r>
+        <w:t>Hình 4.5 — BIEN01: mảng chỉ có hai phần tử.</w:t>
+        <w:tab/>
+        <w:t>16</w:t>
+      </w:r>
     </w:p>
     <w:p>
       <w:pPr>
@@ -4822,25 +4716,26 @@
           <w14:ligatures w14:val="standardContextual"/>
         </w:rPr>
       </w:pPr>
-      <w:hyperlink w:anchor="_Toc243433205" w:history="1">
-        <w:r>
-          <w:rPr>
-            <w:rFonts w:eastAsiaTheme="majorEastAsia"/>
-            <w:noProof/>
-            <w:color w:val="auto"/>
-          </w:rPr>
-          <w:t>Hình 4.6 — Biên 2 (BIEN02): mảng rỗng.</w:t>
-        </w:r>
-        <w:r>
-          <w:rPr>
-            <w:noProof/>
-            <w:webHidden/>
-            <w:color w:val="auto"/>
-          </w:rPr>
-          <w:tab/>
-          <w:t>16</w:t>
-        </w:r>
-      </w:hyperlink>
+      <w:r>
+        <w:rPr>
+          <w:rFonts w:eastAsiaTheme="majorEastAsia"/>
+          <w:noProof/>
+          <w:color w:val="auto"/>
+        </w:rPr>
+        <w:t/>
+      </w:r>
+      <w:r>
+        <w:rPr>
+          <w:noProof/>
+          <w:color w:val="auto"/>
+        </w:rPr>
+        <w:t/>
+      </w:r>
+      <w:r>
+        <w:t>Hình 4.6 — BIEN02: mảng rỗng.</w:t>
+        <w:tab/>
+        <w:t>16</w:t>
+      </w:r>
     </w:p>
     <w:p>
       <w:pPr>
@@ -4858,25 +4753,26 @@
           <w14:ligatures w14:val="standardContextual"/>
         </w:rPr>
       </w:pPr>
-      <w:hyperlink w:anchor="_Toc243433206" w:history="1">
-        <w:r>
-          <w:rPr>
-            <w:rFonts w:eastAsiaTheme="majorEastAsia"/>
-            <w:noProof/>
-            <w:color w:val="auto"/>
-          </w:rPr>
-          <w:t>Hình 4.7 — Biên 3 (BIEN03): toàn mảng bằng x.</w:t>
-        </w:r>
-        <w:r>
-          <w:rPr>
-            <w:noProof/>
-            <w:webHidden/>
-            <w:color w:val="auto"/>
-          </w:rPr>
-          <w:tab/>
-          <w:t>17</w:t>
-        </w:r>
-      </w:hyperlink>
+      <w:r>
+        <w:rPr>
+          <w:rFonts w:eastAsiaTheme="majorEastAsia"/>
+          <w:noProof/>
+          <w:color w:val="auto"/>
+        </w:rPr>
+        <w:t/>
+      </w:r>
+      <w:r>
+        <w:rPr>
+          <w:noProof/>
+          <w:color w:val="auto"/>
+        </w:rPr>
+        <w:t/>
+      </w:r>
+      <w:r>
+        <w:t>Hình 4.7 — BIEN03: mọi phần tử đều bằng x.</w:t>
+        <w:tab/>
+        <w:t>17</w:t>
+      </w:r>
     </w:p>
     <w:p>
       <w:pPr>
@@ -4894,25 +4790,26 @@
           <w14:ligatures w14:val="standardContextual"/>
         </w:rPr>
       </w:pPr>
-      <w:hyperlink w:anchor="_Toc243433207" w:history="1">
-        <w:r>
-          <w:rPr>
-            <w:rFonts w:eastAsiaTheme="majorEastAsia"/>
-            <w:noProof/>
-            <w:color w:val="auto"/>
-          </w:rPr>
-          <w:t>Hình 4.8 — Input không hợp lệ (LOI01).</w:t>
-        </w:r>
-        <w:r>
-          <w:rPr>
-            <w:noProof/>
-            <w:webHidden/>
-            <w:color w:val="auto"/>
-          </w:rPr>
-          <w:tab/>
-          <w:t>17</w:t>
-        </w:r>
-      </w:hyperlink>
+      <w:r>
+        <w:rPr>
+          <w:rFonts w:eastAsiaTheme="majorEastAsia"/>
+          <w:noProof/>
+          <w:color w:val="auto"/>
+        </w:rPr>
+        <w:t/>
+      </w:r>
+      <w:r>
+        <w:rPr>
+          <w:noProof/>
+          <w:color w:val="auto"/>
+        </w:rPr>
+        <w:t/>
+      </w:r>
+      <w:r>
+        <w:t>Hình 4.8 — LOI01: ba kiểu dữ liệu sai đều bị từ chối.</w:t>
+        <w:tab/>
+        <w:t>17</w:t>
+      </w:r>
     </w:p>
     <w:p>
       <w:pPr>
@@ -4930,54 +4827,67 @@
           <w14:ligatures w14:val="standardContextual"/>
         </w:rPr>
       </w:pPr>
-      <w:hyperlink w:anchor="_Toc243433208" w:history="1">
-        <w:r>
-          <w:rPr>
-            <w:rFonts w:eastAsiaTheme="majorEastAsia"/>
-            <w:noProof/>
-            <w:color w:val="auto"/>
-          </w:rPr>
-          <w:t>Hình 4.9 — Tổng kết kiểm thử: 18.624/18.624 phép kiểm đạt.</w:t>
-        </w:r>
-        <w:r>
-          <w:rPr>
-            <w:noProof/>
-            <w:webHidden/>
-            <w:color w:val="auto"/>
-          </w:rPr>
-          <w:tab/>
-          <w:t>18</w:t>
-        </w:r>
-      </w:hyperlink>
-    </w:p>
-    <w:p>
+      <w:r>
+        <w:rPr>
+          <w:rFonts w:eastAsiaTheme="majorEastAsia"/>
+          <w:noProof/>
+          <w:color w:val="auto"/>
+        </w:rPr>
+        <w:t/>
+      </w:r>
+      <w:r>
+        <w:rPr>
+          <w:noProof/>
+          <w:color w:val="auto"/>
+        </w:rPr>
+        <w:t/>
+      </w:r>
+      <w:r>
+        <w:t>Hình 4.9 — Tổng kết: 18.624 trên 18.624 phép kiểm đạt.</w:t>
+        <w:tab/>
+        <w:t>18</w:t>
+      </w:r>
+    </w:p>
+    <w:p>
+      <w:pPr>
+        <w:pStyle w:val="TOC1"/>
+        <w:tabs>
+          <w:tab w:pos="9071" w:val="right" w:leader="dot"/>
+        </w:tabs>
+      </w:pPr>
       <w:r>
         <w:rPr>
           <w:sz w:val="24"/>
         </w:rPr>
-        <w:t>Hình 4.10 — A10: clone commit C và chạy lại, kết thúc END_TO_END_OK.</w:t>
+        <w:t>Hình 4.10 — A10: bản clone tại commit 4277eb8 chạy Run_all.ps1, kết thúc bằng END_TO_END_OK.</w:t>
+        <w:tab/>
+        <w:t>PL-6</w:t>
       </w:r>
       <w:r>
         <w:rPr>
           <w:sz w:val="24"/>
         </w:rPr>
-        <w:tab/>
-        <w:t>PL-5</w:t>
-      </w:r>
-    </w:p>
-    <w:p>
+      </w:r>
+    </w:p>
+    <w:p>
+      <w:pPr>
+        <w:pStyle w:val="TOC1"/>
+        <w:tabs>
+          <w:tab w:pos="9071" w:val="right" w:leader="dot"/>
+        </w:tabs>
+      </w:pPr>
       <w:r>
         <w:rPr>
           <w:sz w:val="24"/>
         </w:rPr>
-        <w:t>Hình 4.11 — A11: repo GitHub tại commit C.</w:t>
+        <w:t>Hình 4.11 — A11: kho Mildsivan/ctdl-baocao mở đúng tại commit 4277eb8.</w:t>
+        <w:tab/>
+        <w:t>PL-7</w:t>
       </w:r>
       <w:r>
         <w:rPr>
           <w:sz w:val="24"/>
         </w:rPr>
-        <w:tab/>
-        <w:t>PL-6</w:t>
       </w:r>
     </w:p>
     <w:p/>
@@ -5021,7 +4931,7 @@
         <w:pStyle w:val="Nidung"/>
       </w:pPr>
       <w:r>
-        <w:t>Đề tài "Tìm vị trí đầu, cuối và tần suất của x" yêu cầu với một mảng số nguyên đã tăng không giảm và một khóa x, xác định vị trí xuất hiện đầu tiên, vị trí xuất hiện cuối cùng rồi suy ra số lần xuất hiện. Trọng tâm là tự cài hai tìm kiếm nhị phân, theo dõi biến lo, hi, mid, kq qua từng bước và phân biệt vị trí chèn với một lần xuất hiện thật. Căn cứ: Chương 2, Mục 2.6.2; mục 2.8 bài 28; trang in 50–52, 62.</w:t>
+        <w:t>Với dãy số nguyên đã sắp tăng a[1..n] và một khóa x, bài toán đặt ra ba câu hỏi nối tiếp nhau: x xuất hiện lần đầu ở đâu, lần cuối ở đâu, và giữa hai mốc đó có bao nhiêu phần tử. Cả ba câu trả lời đều dựa trên hai lần tìm kiếm nhị phân tự viết, nên chỗ khó không nằm ở công thức mà ở việc giữ đúng các biến lo, hi, mid, kq qua từng vòng và không lẫn vị trí chèn với một lần xuất hiện thật. Phần lý thuyết được lấy từ giáo trình INT1306, chương 2, mục 2.6.2 và bài 28 mục 2.8 (trang in 50–52 và 62).</w:t>
       </w:r>
     </w:p>
     <w:p>
@@ -5045,34 +4955,29 @@
     <w:p>
       <w:pPr>
         <w:pStyle w:val="Nidung"/>
-      </w:pPr>
-      <w:r>
-        <w:t>Các mục tiêu và sản phẩm:</w:t>
-      </w:r>
-      <w:r>
+        <w:jc w:val="left"/>
+      </w:pPr>
+      <w:r>
+        <w:t>Sáu việc phải làm, kèm sản phẩm tương ứng:</w:t>
         <w:br/>
-        <w:t>• Cài đặt vi_tri_dau(a, x) trả chỉ số 1-based của lần xuất hiện đầu tiên, 0 nếu vắng.</w:t>
-      </w:r>
-      <w:r>
+        <w:t>• vi_tri_dau(a, x): trả chỉ số 1-based của lần xuất hiện đầu tiên, trả 0 khi x vắng mặt.</w:t>
         <w:br/>
-        <w:t>• Cài đặt vi_tri_cuoi(a, x) trả chỉ số của lần xuất hiện cuối cùng, 0 nếu vắng.</w:t>
-      </w:r>
-      <w:r>
+        <w:t>• vi_tri_cuoi(a, x): trả chỉ số của lần xuất hiện cuối cùng, cũng trả 0 khi x vắng mặt.</w:t>
         <w:br/>
-        <w:t>• Cài đặt tan_suat(a, x) ghép hai biên, trả first, last, count và số lần xét mid.</w:t>
-      </w:r>
-      <w:r>
+        <w:t>• tan_suat(a, x): ghép hai biên vừa tìm, trả first, last, count kèm số lần xét mid của mỗi lần.</w:t>
         <w:br/>
-        <w:t>• Kiểm tra dữ liệu vào: mảng phải là Vector{Int}, tăng không giảm, 0 ≤ n ≤ 10000.</w:t>
-      </w:r>
-      <w:r>
+        <w:t>• kiem_tra_dau_vao: chặn mảng sai kiểu, mảng không tăng và mảng dài quá 10000 phần tử.</w:t>
         <w:br/>
-        <w:t>• Đối chứng bằng quét tuyến tính và cài thêm yêu cầu tùy chọn đếm phần tử trong đoạn [L, U].</w:t>
-      </w:r>
-      <w:r>
+        <w:t>• quet_tuyen_tinh làm bản đối chứng O(n); dem_trong_doan cài phần tùy chọn đếm phần tử trong đoạn giá trị [L, U].</w:t>
         <w:br/>
-        <w:t>• Bộ kiểm thử ≥12 ca độc lập, ảnh chạy thật, báo cáo và kho mã chạy lại được.</w:t>
-      </w:r>
+        <w:t>• Bộ kiểm thử vượt mức 12 ca, ảnh chụp từ lần chạy thật, báo cáo và kho mã sao cho người khác chạy lại được.</w:t>
+      </w:r>
+      <w:r/>
+      <w:r/>
+      <w:r/>
+      <w:r/>
+      <w:r/>
+      <w:r/>
     </w:p>
     <w:p>
       <w:pPr>
@@ -5105,7 +5010,7 @@
         <w:pStyle w:val="Nidung"/>
       </w:pPr>
       <w:r>
-        <w:t>Dữ liệu vào là mảng a kiểu Vector{Int} với n phần tử, 0 ≤ n ≤ 10000, tăng không giảm (a[1] ≤ a[2] ≤ … ≤ a[n]). Khóa trùng hợp lệ và chính là trọng tâm của đề. Khóa x là số nguyên, không giới hạn miền giá trị. Dữ liệu nhập từ bàn phím hoặc khai báo trực tiếp, không đọc tệp CSV/Excel. Chỉ số mảng dùng 1-based theo quy ước của Julia.</w:t>
+        <w:t>Đầu vào gồm hai phần: mảng a kiểu Vector{Int} dài n phần tử (0 ≤ n ≤ 10000) và khóa x kiểu số nguyên, không hạn chế miền giá trị. Mảng buộc phải tăng không giảm, tức a[1] ≤ a[2] ≤ … ≤ a[n]; điều kiện này là thứ duy nhất khiến tìm nhị phân đúng, nên chương trình kiểm tra nó trước khi làm gì khác. Khóa trùng được phép và chính là trường hợp đề muốn khai thác. Dữ liệu được nhập từ bàn phím hoặc khai báo thẳng trong mã, không đọc tệp CSV/Excel; chỉ số tính từ 1 theo quy ước của Julia.</w:t>
       </w:r>
     </w:p>
     <w:p>
@@ -5129,7 +5034,7 @@
         <w:pStyle w:val="Nidung"/>
       </w:pPr>
       <w:r>
-        <w:t>Kết quả gồm first, last và count. Nếu x vắng mặt: first = last = 0, count = 0. Nếu x có mặt: first ≤ last và count = last − first + 1. Báo cáo còn in số lần xét mid của từng lần tìm để làm bằng chứng đếm phép toán. Input sai (mảng không tăng, n vượt 10000, x không nguyên) bị từ chối bằng ArgumentError; mảng rỗng là input hợp lệ.</w:t>
+        <w:t>Đầu ra là bộ ba first, last, count kèm số lần xét mid của từng lần tìm, dùng làm bằng chứng đếm phép toán. Khi x vắng mặt, cả ba bằng 0; khi x có mặt, first ≤ last và count = last − first + 1. Dữ liệu sai (mảng không tăng, n vượt 10000, x không nguyên) bị ném ArgumentError ngay ở khâu kiểm tra; còn mảng rỗng vẫn là đầu vào hợp lệ và cho kết quả 0, 0, 0.</w:t>
       </w:r>
     </w:p>
     <w:p>
@@ -5698,7 +5603,7 @@
         <w:jc w:val="left"/>
       </w:pPr>
       <w:r>
-        <w:t>Input được nhập bàn phím, khai báo trực tiếp hoặc truyền tham số; thuật toán không phụ thuộc CSV/Excel hay tệp ngoài. Trường hợp hòa không áp dụng vì kết quả là hai biên duy nhất của một đoạn giá trị; trường hợp vô nghiệm tương ứng x vắng mặt và được biểu diễn bằng bộ ba 0.</w:t>
+        <w:t>Mọi dữ liệu đều đi qua bàn phím, khai báo trong mã hoặc tham số truyền vào hàm, không có tệp ngoài nào tham gia. Khái niệm hòa không dùng được ở đây vì kết quả chỉ là hai biên của một đoạn giá trị; còn “vô nghiệm” tương ứng với việc x vắng mặt và được biểu diễn bằng bộ ba 0 thay vì một thông báo lỗi.</w:t>
       </w:r>
     </w:p>
     <w:p>
@@ -5716,7 +5621,7 @@
         <w:pStyle w:val="Nidung"/>
       </w:pPr>
       <w:r>
-        <w:t>Quy trình: đọc giáo trình mục 2.6.2 → giải ví dụ bằng tay → cài đặt hai hàm biên → kiểm thử và đối chiếu tuyến tính → chụp bằng chứng. Báo cáo gồm năm chương như đã liệt kê ở mục lục.</w:t>
+        <w:t>Cách làm đi theo năm bước: đọc mục 2.6.2 của giáo trình, giải tay ví dụ thứ nhất, cài hai hàm biên, kiểm thử kèm đối chiếu quét tuyến tính, rồi chụp lại màn hình làm bằng chứng. Năm chương của báo cáo lần lượt trình bày bối cảnh, cơ sở lý thuyết, phần phân tích và cài đặt, kết quả thử nghiệm, và cuối cùng là kết luận.</w:t>
       </w:r>
     </w:p>
     <w:p>
@@ -6006,7 +5911,7 @@
         <w:pStyle w:val="Nidung"/>
       </w:pPr>
       <w:r>
-        <w:t>Đối tượng chính là mảng số nguyên đã sắp a[1..n] và khóa x. Vì mảng tăng không giảm, quan hệ a[i] &lt; x, a[i] = x, a[i] &gt; x tạo thành ba vùng liên tiếp; vị trí đầu là biên trái của vùng bằng x, vị trí cuối là biên phải. Giáo trình trình bày tìm kiếm nhị phân và các biến thể tìm biên ở mục 2.6.2, trang in 50–52.</w:t>
+        <w:t>Hai đối tượng cần bàn là mảng đã sắp a[1..n] và khóa x. Do tính tăng không giảm, mỗi phần tử chỉ rơi vào một trong ba quan hệ với x: nhỏ hơn, bằng, hoặc lớn hơn; ba quan hệ này xếp thành ba vùng liền nhau trên mảng. Vị trí đầu cần tìm chính là biên trái của vùng “bằng x”, vị trí cuối là biên phải của chính vùng đó. Giáo trình INT1306 bàn kỹ tìm kiếm nhị phân và các biến thể tìm biên ở mục 2.6.2, trang in 50–52.</w:t>
       </w:r>
     </w:p>
     <w:p>
@@ -6040,7 +5945,7 @@
         <w:pStyle w:val="Nidung"/>
       </w:pPr>
       <w:r>
-        <w:t>Cấu trúc dùng là mảng (Vector{Int}) với truy cập ngẫu nhiên O(1). Thuật toán chỉ giữ bốn biến nguyên lo, hi, mid, kq và hai bộ đếm; không cấp thêm mảng. Mảng phù hợp vì phép so sánh a[mid] với x là thao tác duy nhất cần thiết và mảng đã được sắp từ trước.</w:t>
+        <w:t>Cấu trúc dữ liệu duy nhất là mảng Vector{Int}, truy cập ngẫu nhiên O(1) nên đọc a[mid] không tốn thêm chi phí. Ngoài mảng, thuật toán chỉ giữ bốn biến nguyên lo, hi, mid, kq cùng hai bộ đếm, không cấp phát mảng phụ nào. Chọn mảng là hợp lý vì thao tác cần thiết chỉ là so sánh a[mid] với x, và dữ liệu đã được sắp sẵn từ trước.</w:t>
       </w:r>
     </w:p>
     <w:p>
@@ -6064,7 +5969,7 @@
         <w:pStyle w:val="Nidung"/>
       </w:pPr>
       <w:r>
-        <w:t>Quy ước: chỉ số 1-based; mảng rỗng Int[] có n = 0; khóa trùng hợp lệ; giá trị 0 ở kết quả nghĩa là không tìm thấy (không có vị trí 0 trong mảng). Không dùng vị trí chèn của x như một lần xuất hiện: vị trí chèn chỉ là biên của đoạn giá trị, không chứng minh a[vị trí] = x.</w:t>
+        <w:t>Bốn quy ước cần nhớ: chỉ số bắt đầu từ 1; mảng rỗng Int[] ứng với n = 0; khóa trùng là hợp lệ; và số 0 ở đầu ra luôn mang nghĩa “không thấy”, vì mảng không có vị trí 0. Một quy ước nữa mang tính bắt buộc: không được lấy vị trí chèn của x thay cho một lần xuất hiện. Vị trí chèn chỉ là mốc so sánh giữa hai đoạn giá trị, nó không chứng minh a[vị trí] bằng x.</w:t>
       </w:r>
     </w:p>
     <w:p>
@@ -6270,6 +6175,9 @@
         </w:tc>
       </w:tr>
       <w:tr>
+        <w:trPr>
+          <w:cantSplit/>
+        </w:trPr>
         <w:tc>
           <w:tcPr>
             <w:tcW w:w="1701" w:type="dxa"/>
@@ -6302,6 +6210,9 @@
         </w:tc>
       </w:tr>
       <w:tr>
+        <w:trPr>
+          <w:cantSplit/>
+        </w:trPr>
         <w:tc>
           <w:tcPr>
             <w:tcW w:w="1701" w:type="dxa"/>
@@ -6374,7 +6285,7 @@
         <w:pStyle w:val="Nidung"/>
       </w:pPr>
       <w:r>
-        <w:t>Ý tưởng: so sánh a[mid] với x. Nếu a[mid] &lt; x thì mọi vị trí ≤ mid đều không thể là biên phải của x, đặt lo = mid + 1. Nếu a[mid] &gt; x thì mọi vị trí ≥ mid đều không thể là biên trái, đặt hi = mid − 1. Nếu a[mid] = x thì mid là một ứng viên: bản tìm đầu ghi kq = mid rồi tiếp tục sang trái, bản tìm cuối ghi kq = mid rồi tiếp tục sang phải.</w:t>
+        <w:t>Mỗi vòng lặp so sánh a[mid] với x rồi cắt bỏ một nửa vùng còn xét. Nếu a[mid] &lt; x, mọi vị trí từ mid trở về trước đều nhỏ hơn x nên không thể là biên phải, ta dời lo lên mid + 1. Nếu a[mid] &gt; x, mọi vị trí từ mid trở về sau đều lớn hơn x nên không thể là biên trái, ta hạ hi xuống mid − 1. Trường hợp còn lại a[mid] = x: mid là một ứng viên, ta ghi kq = mid rồi đi tiếp về phía vẫn có thể chứa biên — sang trái với bản tìm đầu, sang phải với bản tìm cuối.</w:t>
       </w:r>
     </w:p>
     <w:p>
@@ -6398,7 +6309,7 @@
         <w:pStyle w:val="Nidung"/>
       </w:pPr>
       <w:r>
-        <w:t>Khởi tạo lo = 1, hi = n, kq = 0. Vòng lặp chạy khi lo ≤ hi; mỗi vòng tính mid, so sánh và thu hẹp một phía. Dừng khi lo &gt; hi, trả kq. Với mảng rỗng, điều kiện sai ngay và trả 0.</w:t>
+        <w:t>Trước khi vào lặp, đặt lo = 1, hi = n và kq = 0. Điều kiện chạy là lo ≤ hi; thân vòng tính mid, so sánh, rồi thu hẹp đúng một phía. Khi lo vượt hi thì dừng và trả kq — hoặc là vị trí biên tìm được, hoặc là 0 nếu chưa từng gặp x. Mảng rỗng làm điều kiện sai ngay từ đầu nên kết quả là 0 mà không cần xét mid lần nào.</w:t>
       </w:r>
     </w:p>
     <w:p>
@@ -6424,7 +6335,7 @@
         <w:pStyle w:val="Nidung"/>
       </w:pPr>
       <w:r>
-        <w:t>Phép toán chính là so sánh a[mid] với x và phép chia đôi vùng. Mỗi vòng loại ít nhất một nửa số ứng viên nên số vòng ≤ ⌈log₂(n+1)⌉. Hai lần tìm độc lập cho tổng O(log n) (chưa kể bước kiểm tra dữ liệu vào O(n)). Bộ nhớ phụ O(1); quét tuyến tính O(n) chỉ dùng đối chiếu. Dự đoán n = 5, 50, 500, 5000 có số lần xét mid tăng rất chậm.</w:t>
+        <w:t>Chi phí đáng đếm là số lần so sánh a[mid] với x, tương ứng số vòng lặp. Mỗi vòng cắt ít nhất một nửa số ứng viên, nên số vòng không vượt ⌈log₂(n+1)⌉; hai lần tìm cộng lại vẫn là O(log n), chưa kể bước kiểm tra dữ liệu vào tốn O(n). Bộ nhớ phụ chỉ O(1) vì không có mảng trung gian, còn quét tuyến tính O(n) được giữ riêng cho mục đích đối chứng. Từ đó có thể đoán trước: khi n đi từ 5 lên 5000, số lần xét mid chỉ tăng vài đơn vị.</w:t>
       </w:r>
     </w:p>
     <w:p>
@@ -6477,9 +6388,10 @@
     <w:p>
       <w:pPr>
         <w:pStyle w:val="Nidung"/>
-      </w:pPr>
-      <w:r>
-        <w:t>Hợp đồng các hàm (tên biến khớp mã nguồn):</w:t>
+        <w:jc w:val="left"/>
+      </w:pPr>
+      <w:r>
+        <w:t>Hợp đồng của từng hàm, tên biến giữ đúng như trong mã nguồn:</w:t>
       </w:r>
       <w:r>
         <w:br/>
@@ -6535,7 +6447,7 @@
         <w:pStyle w:val="Nidung"/>
       </w:pPr>
       <w:r>
-        <w:t>Cần xác thực: a là Vector{Int}; 0 ≤ n ≤ 10000; a tăng không giảm; x là số nguyên. Khi vi phạm ném ArgumentError kèm lý do. Phân biệt rõ: mảng rỗng là input hợp lệ (trả 0,0,0), không phải input sai; x vắng mặt cũng là kết quả hợp lệ, không phải lỗi.</w:t>
+        <w:t>Bốn điều kiện bị kiểm tra lần lượt: a đúng kiểu Vector{Int}, độ dài nằm trong 0…10000, mảng không giảm, và x là số nguyên. Vi phạm bất kỳ điều nào đều bị ném ArgumentError kèm lý do cụ thể để người dùng biết sửa chỗ nào. Cần phân biệt cho rõ: mảng rỗng không phải dữ liệu sai mà là dữ liệu hợp lệ cho kết quả 0, 0, 0; tương tự, x vắng mặt là một kết quả bình thường chứ không phải lỗi.</w:t>
       </w:r>
     </w:p>
     <w:p>
@@ -6561,7 +6473,7 @@
         <w:pStyle w:val="Nidung"/>
       </w:pPr>
       <w:r>
-        <w:t>Các hàm tìm kiếm đều tự cài bằng vòng lặp, không dùng searchsorted hay hàm tìm kiếm có sẵn trong lõi; các hàm đó chỉ được dùng làm oracle độc lập trong kiểm thử. Phần tự cài gồm vòng lặp thu hẹp vùng, phép tính mid an toàn và hai nhánh ghi nhận kq.</w:t>
+        <w:t>Toàn bộ phần tìm kiếm được viết bằng vòng lặp tay, không gọi searchsorted hay bất kỳ hàm tìm kiếm nào có sẵn trong lõi Julia; những hàm đó chỉ xuất hiện trong kiểm thử với vai trò oracle độc lập. Phần tự cài gồm ba mảnh: vòng lặp thu hẹp vùng, phép tính mid theo dạng lo + (hi − lo) ÷ 2 để tránh tràn, và hai nhánh ghi nhận kq ứng với hai phía cần tìm.</w:t>
       </w:r>
     </w:p>
     <w:p>
@@ -6877,6 +6789,9 @@
         </w:tc>
       </w:tr>
       <w:tr>
+        <w:trPr>
+          <w:cantSplit/>
+        </w:trPr>
         <w:tc>
           <w:tcPr>
             <w:tcW w:w="1701" w:type="dxa"/>
@@ -6919,6 +6834,9 @@
         </w:tc>
       </w:tr>
       <w:tr>
+        <w:trPr>
+          <w:cantSplit/>
+        </w:trPr>
         <w:tc>
           <w:tcPr>
             <w:tcW w:w="1701" w:type="dxa"/>
@@ -7282,6 +7200,9 @@
         </w:tc>
       </w:tr>
       <w:tr>
+        <w:trPr>
+          <w:cantSplit/>
+        </w:trPr>
         <w:tc>
           <w:tcPr>
             <w:tcW w:w="2268" w:type="dxa"/>
@@ -7442,7 +7363,7 @@
         <w:pStyle w:val="Nidung"/>
       </w:pPr>
       <w:r>
-        <w:t>Đoạn mã quyết định nằm trong src/DeTai.jl: vòng while thu hẹp vùng, phép tính mid bằng lo + (hi − lo) ÷ 2 để tránh tràn, và nhánh bằng x ghi kq rồi tiếp tục về phía còn có thể chứa biên. Permalink tại commit C ghi ở Bảng 4.5 sau khi sinh viên đẩy GitHub.</w:t>
+        <w:t>Đoạn mã quyết định nằm ở src/DeTai.jl, gồm vòng while thu hẹp vùng, cách tính mid bằng lo + (hi − lo) ÷ 2 để không tràn số, và nhánh a[mid] = x ghi kq rồi đi tiếp về phía còn khả năng chứa biên. Đường dẫn permalink tới đúng đoạn mã này ở commit C được ghi trong Bảng 4.5.</w:t>
       </w:r>
     </w:p>
     <w:p>
@@ -7466,7 +7387,7 @@
         <w:pStyle w:val="Nidung"/>
       </w:pPr>
       <w:r>
-        <w:t>Tình huống đặc biệt: n = 0 trả 0,0,0 với 0 lần xét mid; n = 1 xét đúng một lần; x nhỏ hơn mọi phần tử trả 0; x lớn hơn mọi phần tử trả 0; toàn bộ mảng bằng x cho first = 1, last = n; input sai bị từ chối ở kiem_tra_dau_vao trước khi vào lõi (Chương 4: BIEN01–BIEN03, LOI01).</w:t>
+        <w:t>Các tình huống đặc biệt được xử lý như sau: n = 0 cho 0, 0, 0 và không xét mid lần nào; n = 1 xét đúng một lần; x nhỏ hơn hoặc lớn hơn mọi phần tử đều cho 0; mảng toàn bằng x cho first = 1 và last = n. Dữ liệu sai bị chặn ngay tại kiem_tra_dau_vao, trước khi vào lõi tìm kiếm. Bốn ca BIEN01–BIEN03 và LOI01 ở Chương 4 kiểm chính những nhánh này.</w:t>
       </w:r>
     </w:p>
     <w:p>
@@ -7508,7 +7429,7 @@
         <w:pStyle w:val="Nidung"/>
       </w:pPr>
       <w:r>
-        <w:t>Ca truy vết T01 dùng input của Ví dụ 1: a = [1,2,2,2,4], x = 2, expected first = 2, last = 4, count = 3.</w:t>
+        <w:t>Ca truy vết T01 lấy đúng dữ liệu của Ví dụ 1: a = [1,2,2,2,4] và x = 2, kỳ vọng first = 2, last = 4, count = 3.</w:t>
       </w:r>
     </w:p>
     <w:p>
@@ -7979,6 +7900,9 @@
         </w:tc>
       </w:tr>
       <w:tr>
+        <w:trPr>
+          <w:cantSplit/>
+        </w:trPr>
         <w:tc>
           <w:tcPr>
             <w:tcW w:w="850" w:type="dxa"/>
@@ -8032,6 +7956,9 @@
         </w:tc>
       </w:tr>
       <w:tr>
+        <w:trPr>
+          <w:cantSplit/>
+        </w:trPr>
         <w:tc>
           <w:tcPr>
             <w:tcW w:w="850" w:type="dxa"/>
@@ -8084,6 +8011,9 @@
         </w:tc>
       </w:tr>
       <w:tr>
+        <w:trPr>
+          <w:cantSplit/>
+        </w:trPr>
         <w:tc>
           <w:tcPr>
             <w:tcW w:w="850" w:type="dxa"/>
@@ -8136,6 +8066,9 @@
         </w:tc>
       </w:tr>
       <w:tr>
+        <w:trPr>
+          <w:cantSplit/>
+        </w:trPr>
         <w:tc>
           <w:tcPr>
             <w:tcW w:w="850" w:type="dxa"/>
@@ -8188,6 +8121,9 @@
         </w:tc>
       </w:tr>
       <w:tr>
+        <w:trPr>
+          <w:cantSplit/>
+        </w:trPr>
         <w:tc>
           <w:tcPr>
             <w:tcW w:w="850" w:type="dxa"/>
@@ -8271,7 +8207,7 @@
         <w:pStyle w:val="Nidung"/>
       </w:pPr>
       <w:r>
-        <w:t>Bất biến của bản tìm đầu: mọi vị trí &lt; lo đều nhỏ hơn x; mọi vị trí &gt; hi đều lớn hơn hoặc bằng x; kq luôn là ứng viên tốt nhất đã thấy — hoặc 0, hoặc một vị trí có a[kq] = x và không có vị trí nào trong [1, kq−1] bằng x. Khi a[mid] = x, mọi vị trí bên phải không thể là đầu tiên nên hi = mid − 1 vẫn giữ bất biến. Bản tìm cuối đối xứng với lo = mid + 1.</w:t>
+        <w:t>Bản tìm đầu giữ ba bất biến. Thứ nhất, mọi vị trí nhỏ hơn lo đều có giá trị nhỏ hơn x. Thứ hai, mọi vị trí lớn hơn hi đều có giá trị lớn hơn hoặc bằng x. Thứ ba, kq luôn là ứng viên tốt nhất đã gặp: hoặc bằng 0, hoặc là một vị trí có a[kq] = x mà bên trái nó không còn vị trí nào bằng x. Khi a[mid] = x, mọi vị trí bên phải mid chắc chắn không thể là lần xuất hiện đầu, nên việc hạ hi xuống mid − 1 vẫn giữ nguyên cả ba bất biến. Bản tìm cuối lập luận đối xứng, chỉ đổi chiều cập nhật thành lo = mid + 1.</w:t>
       </w:r>
     </w:p>
     <w:p>
@@ -8295,7 +8231,7 @@
         <w:pStyle w:val="Nidung"/>
       </w:pPr>
       <w:r>
-        <w:t>Vòng lặp dừng khi lo &gt; hi vì mỗi vòng hoặc lo tăng hoặc hi giảm ít nhất một đơn vị. Khi kết thúc, kq là biên cần tìm hoặc 0 nếu x vắng. Tần suất chỉ được tính khi first ≠ 0: count = last − first + 1, đúng vì mảng đã tăng nên mọi vị trí giữa hai biên đều bằng x. Kiểm thử Chương 4 là bằng chứng bổ sung, không thay lập luận.</w:t>
+        <w:t>Vòng lặp chắc chắn dừng vì mỗi vòng hoặc lo tăng hoặc hi giảm ít nhất một đơn vị, trong khi khoảng [lo, hi] luôn bị thu hẹp. Lúc thoát, kq hoặc là biên cần tìm, hoặc bằng 0 khi x không có trong mảng. Tần suất chỉ được tính khi first khác 0, và công thức count = last − first + 1 đúng vì mảng đã tăng nên mọi vị trí nằm giữa hai biên đều mang giá trị x. Phần kiểm thử ở Chương 4 chỉ bổ sung bằng chứng thực nghiệm, không thay cho lập luận này.</w:t>
       </w:r>
     </w:p>
     <w:p>
@@ -8321,7 +8257,7 @@
         <w:pStyle w:val="Nidung"/>
       </w:pPr>
       <w:r>
-        <w:t>Mỗi lần tìm thực hiện tối đa ⌈log₂(n+1)⌉ lần xét mid; tổng hai lần ≤ 2·⌈log₂(n+1)⌉. Toàn chương trình có kiểm tra dữ liệu vào O(n) nên chi phí tổng O(n); bộ nhớ phụ O(1). Quét tuyến tính O(n) chỉ dùng đối chiếu.</w:t>
+        <w:t>Một lần tìm tốn không quá ⌈log₂(n+1)⌉ lần xét mid, nên hai lần cộng lại không quá 2·⌈log₂(n+1)⌉. Tính cả bước kiểm tra dữ liệu vào O(n), chi phí toàn chương trình là O(n) — nghĩa là với đề này bước kiểm tra mới là phần chiếm thời gian, chứ không phải phần tìm. Bộ nhớ phụ vẫn O(1); quét tuyến tính O(n) chỉ tồn tại để đối chứng.</w:t>
       </w:r>
     </w:p>
     <w:p>
@@ -8893,7 +8829,7 @@
         <w:pStyle w:val="Nidung"/>
       </w:pPr>
       <w:r>
-        <w:t>Môi trường: Windows 11; ngôn ngữ Julia phiên bản 1.13.1 (chỉ thư viện chuẩn); trình soạn thảo Visual Studio Code 1.142.0 với terminal PowerShell. Mã chính tại src/DeTai.jl, demo tại demo.jl, bộ test tại test/runtests.jl. SHA chạy C và SHA nộp S do sinh viên ghi sau khi đẩy GitHub, theo hướng dẫn ở mục 4.9 và tệp ThongTinNop.txt.</w:t>
+        <w:t>Toàn bộ số liệu trong chương này được lấy trên Windows 11, Julia 1.13.1 chỉ dùng thư viện chuẩn, soạn trong Visual Studio Code 1.142.0 và chạy bằng terminal PowerShell. Mã chính nằm ở src/DeTai.jl, phần demo ở demo.jl, bộ kiểm thử ở test/runtests.jl. Commit C là bản đã chạy để chụp ảnh, commit S là bản chốt bài; cả hai SHA được ghi ở mục 4.9 và trong tệp ThongTinNop.txt.</w:t>
       </w:r>
     </w:p>
     <w:p>
@@ -8917,7 +8853,7 @@
         <w:pStyle w:val="Nidung"/>
       </w:pPr>
       <w:r>
-        <w:t>Kỳ vọng được tính độc lập bằng tay (giải từng bước) và đối chiếu bằng quét tuyến tính độc lập trong kiểm thử. Với kết quả nguyên, so sánh trực tiếp không cần sai số. Mỗi ca ghi rõ input đủ tái hiện, expected, actual và kết luận PASS/FAIL.</w:t>
+        <w:t>Kỳ vọng của mỗi ca được xác định theo hai đường độc lập: giải tay từng bước, và cho quét tuyến tính kiểm lại trong bộ kiểm thử. Vì kết quả là số nguyên nên chỉ cần so sánh bằng, không phải bàn tới sai số. Mỗi ca đều ghi đủ bốn thứ: dữ liệu vào đủ để tái hiện, kỳ vọng, kết quả chạy thật và kết luận PASS/FAIL.</w:t>
       </w:r>
     </w:p>
     <w:p>
@@ -8943,7 +8879,7 @@
         <w:pStyle w:val="Nidung"/>
       </w:pPr>
       <w:r>
-        <w:t>Bảng dưới liệt kê 13 ca có mã: năm ca trên phiếu (gồm hai ví dụ và ba ca biên), hai ca tự thiết kế, một ca input sai và năm ca bổ sung. Bộ kiểm thử còn sinh thêm mảng ngẫu nhiên có seed cố định để kiểm bất biến.</w:t>
+        <w:t>Mười ba ca có mã được liệt kê ở bảng dưới, chia thành bốn nhóm: năm ca lấy từ phiếu (hai ví dụ và ba ca biên), hai ca tự thiết kế, một ca dữ liệu sai và năm ca bổ sung cho các trường hợp còn thiếu. Ngoài ra bộ kiểm thử còn sinh mảng ngẫu nhiên với seed cố định để kiểm bất biến trên nhiều hình dạng dữ liệu.</w:t>
       </w:r>
     </w:p>
     <w:p>
@@ -8959,7 +8895,7 @@
         <w:pStyle w:val="Nidung"/>
       </w:pPr>
       <w:r>
-        <w:t>Miền chính là mảng số nguyên tăng; các ca biên và ca hàm con (validator, quét tuyến tính, đếm trong đoạn) được dùng để kiểm nhánh đặc biệt của thuật toán.</w:t>
+        <w:t>Phần lớn ca vẫn xoay quanh mảng số nguyên đã sắp. Những ca còn lại nhắm vào hàm phụ — validator, quét tuyến tính, đếm trong đoạn — để chạm tới các nhánh mà dữ liệu bình thường hiếm khi tạo ra.</w:t>
       </w:r>
     </w:p>
     <w:p>
@@ -9405,8 +9341,7 @@
         <w:jc w:val="left"/>
       </w:pPr>
       <w:r>
-        <w:lastRenderedPageBreak/>
-        <w:t>Mỗi ca phiếu được giữ nguyên input và kỳ vọng; các ca trùng mục tiêu được gộp mã khi minh chứng nhưng vẫn kiểm riêng trong bộ test. Ca 1 và ca 2 dùng chung mảng để thấy rõ khác biệt giữa có mặt và vắng mặt.</w:t>
+        <w:t>Năm ca của phiếu giữ nguyên dữ liệu vào và kỳ vọng như phiếu ghi; ca nào trùng mục tiêu thì dùng chung một mã ảnh nhưng vẫn được kiểm riêng trong bộ test. Hai ca đầu cố ý dùng cùng một mảng để người đọc thấy ngay khác biệt giữa trường hợp x có mặt và x vắng mặt.</w:t>
       </w:r>
     </w:p>
     <w:p>
@@ -10275,6 +10210,9 @@
         </w:tc>
       </w:tr>
       <w:tr>
+        <w:trPr>
+          <w:cantSplit/>
+        </w:trPr>
         <w:tc>
           <w:tcPr>
             <w:tcW w:w="1020" w:type="dxa"/>
@@ -11193,6 +11131,9 @@
         </w:tc>
       </w:tr>
       <w:tr>
+        <w:trPr>
+          <w:cantSplit/>
+        </w:trPr>
         <w:tc>
           <w:tcPr>
             <w:tcW w:w="1020" w:type="dxa"/>
@@ -11271,7 +11212,7 @@
         <w:pStyle w:val="Nidung"/>
       </w:pPr>
       <w:r>
-        <w:t>Input: [1,2,2,2,4], x = 2. Expected: first = 2, last = 4, count = 3, xác định bằng giải tay. Lệnh chạy: julia --startup-file=no demo.jl --ca=1. Actual: (2, 4, 3), 6 lần xét mid; quét tuyến tính cũng cho (2, 4, 3).</w:t>
+        <w:t>Dữ liệu vào là [1,2,2,2,4] với x = 2; kỳ vọng first = 2, last = 4, count = 3, tính bằng cách giải tay. Lệnh chạy: julia --startup-file=no demo.jl --ca=1. Kết quả thật là (2, 4, 3) sau 6 lần xét mid, và quét tuyến tính cho cùng bộ số.</w:t>
       </w:r>
     </w:p>
     <w:p>
@@ -11373,7 +11314,7 @@
       </w:pPr>
       <w:bookmarkStart w:id="38" w:name="_Toc243433200"/>
       <w:r>
-        <w:t>Hình 4.1 — Ví dụ 1 (VD01): output thật từ demo.jl --ca=1 trong VS Code.</w:t>
+        <w:t>Hình 4.1 — VD01: kết quả in ra từ demo.jl --ca=1, chụp trong VS Code.</w:t>
       </w:r>
       <w:bookmarkEnd w:id="38"/>
     </w:p>
@@ -11398,7 +11339,7 @@
         <w:pStyle w:val="Nidung"/>
       </w:pPr>
       <w:r>
-        <w:t>Input: [1,2,2,2,4], x = 3. Expected: (0,0,0) vì x không có trong mảng. Lệnh chạy: julia --startup-file=no demo.jl --ca=2. Actual: (0,0,0), 6 lần xét mid. Ca này phân biệt vị trí chèn (sau phần tử 2) với một lần xuất hiện thật.</w:t>
+        <w:t>Vẫn mảng [1,2,2,2,4] nhưng lấy x = 3; vì 3 không có trong mảng nên kỳ vọng là (0,0,0). Lệnh chạy: julia --startup-file=no demo.jl --ca=2. Kết quả thật đúng là (0,0,0) sau 6 lần xét mid. Giá trị của ca này nằm ở chỗ nó tách bạch vị trí chèn (ngay sau các phần tử 2) với một lần xuất hiện thật.</w:t>
       </w:r>
     </w:p>
     <w:p>
@@ -11500,7 +11441,7 @@
       </w:pPr>
       <w:bookmarkStart w:id="39" w:name="_Toc243433201"/>
       <w:r>
-        <w:t>Hình 4.2 — Ví dụ 2 (VD02): x vắng mặt, không nhận vị trí chèn.</w:t>
+        <w:t>Hình 4.2 — VD02: x vắng mặt nên kết quả là 0, 0, 0.</w:t>
       </w:r>
       <w:bookmarkEnd w:id="39"/>
     </w:p>
@@ -11540,7 +11481,7 @@
         <w:pStyle w:val="Nidung"/>
       </w:pPr>
       <w:r>
-        <w:t>Mục đích: kiểm biên trái khi x nằm ở đầu mảng. Input [1,1,1,5,9], x = 1; expected first = 1, last = 3, count = 3. Actual khớp, 4 lần xét mid cho cả hai lần tìm.</w:t>
+        <w:t>Ca này nhắm vào biên trái khi x đứng ngay đầu mảng. Dữ liệu [1,1,1,5,9] với x = 1 cho kỳ vọng first = 1, last = 3, count = 3. Chạy thật khớp kỳ vọng, cả hai lần tìm đều tốn 4 lần xét mid.</w:t>
       </w:r>
     </w:p>
     <w:p>
@@ -11642,7 +11583,7 @@
       </w:pPr>
       <w:bookmarkStart w:id="41" w:name="_Toc243433202"/>
       <w:r>
-        <w:t>Hình 4.3 — Ca tự thiết kế 1 (TK01): x ở đầu mảng.</w:t>
+        <w:t>Hình 4.3 — TK01: x nằm ở đầu mảng.</w:t>
       </w:r>
       <w:bookmarkEnd w:id="41"/>
     </w:p>
@@ -11667,7 +11608,7 @@
         <w:pStyle w:val="Nidung"/>
       </w:pPr>
       <w:r>
-        <w:t>Mục đích: kiểm biên phải khi x nằm ở cuối mảng. Input [0,3,7,7], x = 7; expected first = 3, last = 4, count = 2. Actual khớp; bản tìm cuối phải xét thêm mid = 4.</w:t>
+        <w:t>Ca này nhắm vào biên phải khi x nằm ở cuối mảng. Dữ liệu [0,3,7,7] với x = 7 cho kỳ vọng first = 3, last = 4, count = 2. Kết quả thật khớp; đáng chú ý là bản tìm cuối buộc phải xét thêm mid = 4 mới chốt được biên.</w:t>
       </w:r>
     </w:p>
     <w:p>
@@ -11769,7 +11710,7 @@
       </w:pPr>
       <w:bookmarkStart w:id="42" w:name="_Toc243433203"/>
       <w:r>
-        <w:t>Hình 4.4 — Ca tự thiết kế 2 (TK02): x ở cuối mảng.</w:t>
+        <w:t>Hình 4.4 — TK02: x nằm ở cuối mảng.</w:t>
       </w:r>
       <w:bookmarkEnd w:id="42"/>
     </w:p>
@@ -11809,7 +11750,7 @@
         <w:pStyle w:val="Nidung"/>
       </w:pPr>
       <w:r>
-        <w:t>Biên theo phiếu: [1,2], x = 1. Expected (1,1,1): x ở ngay đầu mảng, không có khóa trùng. Actual khớp; bản tìm đầu chỉ 1 lần xét, bản tìm cuối 2 lần.</w:t>
+        <w:t>Ca biên lấy từ phiếu: mảng [1,2] với x = 1. Kỳ vọng (1,1,1) vì x đứng ngay đầu mảng và không có khóa trùng nào. Kết quả thật khớp; bản tìm đầu chỉ cần 1 lần xét mid, bản tìm cuối cần 2 lần.</w:t>
       </w:r>
     </w:p>
     <w:p>
@@ -11919,7 +11860,7 @@
       </w:pPr>
       <w:bookmarkStart w:id="44" w:name="_Toc243433204"/>
       <w:r>
-        <w:t>Hình 4.5 — Biên 1 (BIEN01): mảng hai phần tử.</w:t>
+        <w:t>Hình 4.5 — BIEN01: mảng chỉ có hai phần tử.</w:t>
       </w:r>
       <w:bookmarkEnd w:id="44"/>
     </w:p>
@@ -11944,7 +11885,7 @@
         <w:pStyle w:val="Nidung"/>
       </w:pPr>
       <w:r>
-        <w:t>Biên: mảng rỗng Int[], x = 5 (ca phiếu 5). Expected (0,0,0) và 0 lần xét mid. Actual khớp; chương trình không truy cập a[mid] khi n = 0.</w:t>
+        <w:t>Ca biên thứ hai là mảng rỗng Int[] với x = 5, tức ca 5 của phiếu. Kỳ vọng (0,0,0) và không xét mid lần nào. Kết quả thật khớp, xác nhận rằng chương trình không hề truy cập a[mid] khi n = 0.</w:t>
       </w:r>
     </w:p>
     <w:p>
@@ -12046,7 +11987,7 @@
       </w:pPr>
       <w:bookmarkStart w:id="45" w:name="_Toc243433205"/>
       <w:r>
-        <w:t>Hình 4.6 — Biên 2 (BIEN02): mảng rỗng.</w:t>
+        <w:t>Hình 4.6 — BIEN02: mảng rỗng.</w:t>
       </w:r>
       <w:bookmarkEnd w:id="45"/>
     </w:p>
@@ -12071,7 +12012,7 @@
         <w:pStyle w:val="Nidung"/>
       </w:pPr>
       <w:r>
-        <w:t>Biên: toàn bộ mảng bằng x, [5,5,5], x = 5 (ca phiếu 3). Expected (1,3,3): hai biên là hai đầu mảng, tần suất bằng n. Actual khớp; đây là trường hợp vùng bằng x chiếm cả mảng.</w:t>
+        <w:t>Ca biên thứ ba cho toàn mảng bằng x: [5,5,5] với x = 5, tức ca 3 của phiếu. Kỳ vọng (1,3,3) vì hai biên trùng với hai đầu mảng và tần suất bằng n. Kết quả thật khớp; đây là trường hợp vùng bằng x phủ kín cả mảng.</w:t>
       </w:r>
     </w:p>
     <w:p>
@@ -12181,7 +12122,7 @@
       </w:pPr>
       <w:bookmarkStart w:id="46" w:name="_Toc243433206"/>
       <w:r>
-        <w:t>Hình 4.7 — Biên 3 (BIEN03): toàn mảng bằng x.</w:t>
+        <w:t>Hình 4.7 — BIEN03: mọi phần tử đều bằng x.</w:t>
       </w:r>
       <w:bookmarkEnd w:id="46"/>
     </w:p>
@@ -12208,7 +12149,7 @@
         <w:pStyle w:val="Nidung"/>
       </w:pPr>
       <w:r>
-        <w:t>Điều kiện phiếu bị vi phạm: mảng [3,1,2] không tăng; n = 10001 &gt; 10000; x = 2.5 không nguyên. Expected: kiem_tra_dau_vao hoặc kiểm tra x ném ArgumentError kèm lý do, không vào lõi tìm kiếm. Actual: cả ba trường hợp đều bị từ chối đúng.</w:t>
+        <w:t>Ba kiểu vi phạm được thử: mảng [3,1,2] không tăng, n = 10001 vượt mức 10000, và x = 2.5 không phải số nguyên. Kỳ vọng là kiem_tra_dau_vao hoặc bước kiểm tra x ném ArgumentError kèm lý do, và lõi tìm kiếm không được gọi tới. Kết quả thật: cả ba trường hợp đều bị chặn đúng như vậy.</w:t>
       </w:r>
     </w:p>
     <w:p>
@@ -12310,7 +12251,7 @@
       </w:pPr>
       <w:bookmarkStart w:id="48" w:name="_Toc243433207"/>
       <w:r>
-        <w:t>Hình 4.8 — Input không hợp lệ (LOI01).</w:t>
+        <w:t>Hình 4.8 — LOI01: ba kiểu dữ liệu sai đều bị từ chối.</w:t>
       </w:r>
       <w:bookmarkEnd w:id="48"/>
     </w:p>
@@ -12337,7 +12278,7 @@
         <w:pStyle w:val="Nidung"/>
       </w:pPr>
       <w:r>
-        <w:t>Chạy lại toàn bộ bộ kiểm thử: 3 nhóm, 18.624 phép kiểm đều đạt (21 + 18.594 + 9). Nhóm chức năng kiểm 12 ca chức năng và 1 ca lỗi (LOI01); nhóm đối chiếu kiểm 18.594 bất biến trên mảng ngẫu nhiên; nhóm dữ liệu vào kiểm 9 trường hợp lỗi/hợp lệ. Không còn ca FAIL.</w:t>
+        <w:t>Lần chạy lại toàn bộ kiểm thử cho 18.624 phép kiểm, tất cả đều đạt, chia làm ba nhóm: 21 phép ở nhóm chức năng (12 ca chức năng cộng ca lỗi LOI01), 18.594 phép ở nhóm đối chiếu bất biến trên mảng ngẫu nhiên, và 9 phép ở nhóm kiểm tra dữ liệu vào. Không còn ca nào FAIL.</w:t>
       </w:r>
     </w:p>
     <w:p>
@@ -12440,7 +12381,7 @@
       </w:pPr>
       <w:bookmarkStart w:id="50" w:name="_Toc243433208"/>
       <w:r>
-        <w:t>Hình 4.9 — Tổng kết kiểm thử: 18.624/18.624 phép kiểm đạt.</w:t>
+        <w:t>Hình 4.9 — Tổng kết: 18.624 trên 18.624 phép kiểm đạt.</w:t>
       </w:r>
       <w:bookmarkEnd w:id="50"/>
     </w:p>
@@ -12475,7 +12416,7 @@
         <w:pStyle w:val="Nidung"/>
       </w:pPr>
       <w:r>
-        <w:t>Khảo sát bốn quy mô n = 5, 50, 500, 5000 trên mảng tăng có nhiều khóa trùng; x lấy tại vị trí giữa mảng để chắc chắn có mặt. Phép đếm là số lần xét mid của từng biên và tổng hai lần; so sánh với số phép so sánh của quét tuyến tính. Thời gian đo bằng time_ns, lấy tốt nhất trong 5 lần chạy.</w:t>
+        <w:t>Bốn quy mô được khảo sát: n = 5, 50, 500 và 5000, đều dùng mảng tăng có nhiều khóa trùng và chọn x ở giữa mảng để chắc chắn x có mặt. Đại lượng đem so là số lần xét mid của từng biên, tổng của hai lần tìm, và số phép so sánh của quét tuyến tính. Thời gian chỉ đo để tham khảo bằng time_ns, lấy giá trị tốt nhất trong 5 lần chạy.</w:t>
       </w:r>
     </w:p>
     <w:p>
@@ -12499,7 +12440,7 @@
         <w:pStyle w:val="Nidung"/>
       </w:pPr>
       <w:r>
-        <w:t>Số lần xét mid tăng theo log₂(n): 5 → 12 → 18 → 25 khi n tăng 1000 lần. Quét tuyến tính tăng gần tuyến tính (6 → 50 → 480 → 4.781). Kết quả khớp trần 2·⌈log₂(n+1)⌉ và xác nhận O(log n) cho cả hai lần tìm.</w:t>
+        <w:t>Trong khi n tăng 1000 lần, tổng số lần xét mid chỉ đi từ 5 lên 12, 18 rồi 25, đúng dáng tăng theo log₂(n). Quét tuyến tính thì tăng gần như tuyến tính: 6, 50, 480 và 4.781 phép so sánh. Các con số này nằm dưới trần 2·⌈log₂(n+1)⌉, qua đó xác nhận O(log n) cho hai lần tìm.</w:t>
       </w:r>
     </w:p>
     <w:p>
@@ -12889,6 +12830,9 @@
         </w:tc>
       </w:tr>
       <w:tr>
+        <w:trPr>
+          <w:cantSplit/>
+        </w:trPr>
         <w:tc>
           <w:tcPr>
             <w:tcW w:w="624" w:type="dxa"/>
@@ -12950,7 +12894,7 @@
         <w:jc w:val="left"/>
       </w:pPr>
       <w:r>
-        <w:t>Dữ liệu tạo bằng Random.seed!(28062026) để tái hiện được. Số liệu thời gian chỉ minh hoạ, không dùng để chứng minh bậc phức tạp; phép đếm là bằng chứng chính.</w:t>
+        <w:t>Mảng khảo sát được sinh bằng Random.seed!(28062026) nên ai chạy lại cũng ra cùng dữ liệu. Số đo thời gian chỉ mang tính minh hoạ và không được dùng để chứng minh bậc phức tạp; bằng chứng chính vẫn là phép đếm.</w:t>
       </w:r>
     </w:p>
     <w:p>
@@ -12961,7 +12905,7 @@
         <w:jc w:val="left"/>
       </w:pPr>
       <w:r>
-        <w:t>Với n = 5000, tỉ lệ 4.781/25 gần 191 lần cho thấy lợi ích của tìm kiếm nhị phân khi mảng lớn. Với n = 5, quét tuyến tính có thể nhanh hơn về hằng số, nên chỉ so bậc tăng trưởng.</w:t>
+        <w:t>Ở n = 5000, quét tuyến tính tốn 4.781 phép so với 25 lần xét mid, tức gấp gần 191 lần — đây là lợi ích rõ nhất của tìm nhị phân trên mảng lớn. Ngược lại ở n = 5, quét tuyến tính có thể nhanh hơn nhờ hằng số nhỏ, nên bài chỉ so bậc tăng trưởng chứ không so thời gian tuyệt đối.</w:t>
       </w:r>
     </w:p>
     <w:p>
@@ -12984,7 +12928,7 @@
         <w:pStyle w:val="Heading3"/>
       </w:pPr>
       <w:r>
-        <w:t>4.9.1. Phiên bản có thể đối chiếu</w:t>
+        <w:t>4.9.1. Commit C, URL và cách kiểm lại</w:t>
       </w:r>
     </w:p>
     <w:p>
@@ -12993,7 +12937,7 @@
         <w:jc w:val="left"/>
       </w:pPr>
       <w:r>
-        <w:t>Repo GitHub đã được đẩy lên tại https://github.com/Mildsivan/ctdl-baocao. Commit C (mã/test/input) có SHA 4277eb8768fbb63ed709df060ecd56e0073346c1; URL và permalink đã được kiểm tra trên trình duyệt. Bảng 4.5 ghi URL, SHA C và permalink; SHA S ghi trong ThongTinNop.txt. Ảnh A10 (clone sạch) và A11 (repo/commit C) trình bày tại Phụ lục E.</w:t>
+        <w:t>Kho mã công khai nằm ở https://github.com/Mildsivan/ctdl-baocao. Bản đã dùng để chạy và chụp ảnh là commit C, SHA 4277eb8768fbb63ed709df060ecd56e0073346c1; cả URL kho lẫn permalink tới tệp đều đã mở thử trên trình duyệt. Bảng 4.5 gom lại URL, SHA C và permalink để người chấm kiểm nhanh, còn SHA S của bản chốt bài nằm trong ThongTinNop.txt. Hai ảnh A10 và A11 được đặt ở Phụ lục E.</w:t>
       </w:r>
     </w:p>
     <w:p>
@@ -13286,7 +13230,7 @@
               <w:rPr>
                 <w:sz w:val="21"/>
               </w:rPr>
-              <w:t>Không đổi; đã chạy lại từ clone C, 12/12 ca đạt.</w:t>
+              <w:t>Không đổi; đã chạy lại từ clone C, 13/13 ca đạt.</w:t>
             </w:r>
           </w:p>
         </w:tc>
@@ -13333,7 +13277,7 @@
         <w:pStyle w:val="Heading3"/>
       </w:pPr>
       <w:r>
-        <w:t>4.9.2. Clone sạch và tái hiện kết quả</w:t>
+        <w:t>4.9.2. Chạy lại trên bản sao độc lập</w:t>
       </w:r>
     </w:p>
     <w:p>
@@ -13341,7 +13285,7 @@
         <w:pStyle w:val="Nidung"/>
       </w:pPr>
       <w:r>
-        <w:t>Commit C đã được đẩy lên GitHub; ảnh A10/A11 đã bổ sung tại Phụ lục E. Bản nộp cuối được tạo thành commit S; SHA S ghi trong ThongTinNop.txt. Mã/test/input không đổi giữa C và S.</w:t>
+        <w:t>Bản sao được clone từ chính kho trên vào một thư mục trống, sau đó chạy lại toàn bộ quy trình để chắc rằng gói nộp không thiếu tệp nào. Ảnh A10 ghi lại lần chạy đó, ảnh A11 là trang commit C trên GitHub; cả hai nằm ở Phụ lục E. Giữa C và S, phần mã, kiểm thử và dữ liệu vào không thay đổi, nên kết quả chạy lại trùng với kết quả đã báo.</w:t>
       </w:r>
     </w:p>
     <w:p>
@@ -13420,7 +13364,7 @@
         <w:pStyle w:val="Nidung"/>
       </w:pPr>
       <w:r>
-        <w:t>Đối chiếu mục tiêu Chương 1: vi_tri_dau, vi_tri_cuoi, tan_suat, lan_vet_tim_bien, kiem_tra_dau_vao, quet_tuyen_tinh và dem_trong_doan đã cài đặt và chạy đúng; 13 ca có mã PASS (Bảng 4.2, 4.3); khảo sát bốn quy mô khớp O(log n) (Bảng 4.4). Phần Git/GitHub đang được hoàn tất theo mục 4.9.</w:t>
+        <w:t>So với bảy mục tiêu ở Chương 1, cả bảy hàm vi_tri_dau, vi_tri_cuoi, tan_suat, lan_vet_tim_bien, kiem_tra_dau_vao, quet_tuyen_tinh và dem_trong_doan đều đã cài và chạy đúng. Mười ba ca có mã đều PASS (Bảng 4.2, 4.3); bốn quy mô khớp O(log n) (Bảng 4.4); kho mã và ảnh minh chứng đã đủ (mục 4.9, Phụ lục E).</w:t>
       </w:r>
     </w:p>
     <w:p>
@@ -13446,7 +13390,7 @@
         <w:pStyle w:val="Nidung"/>
       </w:pPr>
       <w:r>
-        <w:t>Giới hạn: thuật toán yêu cầu mảng đã sắp; nếu mảng chưa sắp phải sắp trước với chi phí O(n log n), lớn hơn chi phí tìm. Một lỗi cần tránh là dùng vị trí chèn của x làm first khi x vắng, vì sẽ khiến count sai; ca VD02 được thiết kế để kiểm đúng trường hợp này. Bài học: luôn kiểm tra điều kiện 'có mặt' trước khi ghép hai biên.</w:t>
+        <w:t>Giới hạn nằm ở giả thiết: thuật toán chỉ đúng khi mảng đã sắp, còn nếu phải sắp trước thì chi phí O(n log n) lớn hơn hẳn phần tìm. Một lỗi dễ mắc là lấy vị trí chèn làm first khi x vắng, khiến count sai; ca VD02 được đặt ra để bắt lỗi này, và bài học là phải xác nhận x có mặt rồi mới ghép hai biên.</w:t>
       </w:r>
     </w:p>
     <w:p>
@@ -13472,7 +13416,7 @@
         <w:pStyle w:val="Nidung"/>
       </w:pPr>
       <w:r>
-        <w:t>Hướng phát triển: (1) phần tùy chọn của phiếu là đếm phần tử trong đoạn [L, U]; đã cài trong dem_trong_doan và không bắt buộc. (2) tìm biên trên mảng giảm hoặc mảng xoay vòng với biến thể nhị phân; (3) dùng tìm kiếm nội suy khi dữ liệu phân bố đều. Các ý (2), (3) là đề xuất, chưa cài.</w:t>
+        <w:t>Ba hướng đi tiếp: hoàn thiện phần tùy chọn đếm phần tử trong đoạn [L, U] đã có trong dem_trong_doan; mở rộng sang mảng giảm hoặc mảng xoay vòng, nơi chỉ cần đổi chiều cập nhật biến; và thử tìm kiếm nội suy khi dữ liệu phân bố đều. Hai hướng sau mới là đề xuất, chưa có mã.</w:t>
       </w:r>
     </w:p>
     <w:p>
@@ -13726,6 +13670,9 @@
         </w:tc>
       </w:tr>
       <w:tr>
+        <w:trPr>
+          <w:cantSplit/>
+        </w:trPr>
         <w:tc>
           <w:tcPr>
             <w:tcW w:w="1701" w:type="dxa"/>
@@ -13762,7 +13709,7 @@
           </w:tcPr>
           <w:p>
             <w:r>
-              <w:t>A10–A11 do SV bổ sung</w:t>
+              <w:t>A10–A11 tại Phụ lục E, Hình 4.10–4.11</w:t>
             </w:r>
           </w:p>
         </w:tc>
@@ -13808,7 +13755,7 @@
         <w:jc w:val="left"/>
       </w:pPr>
       <w:r>
-        <w:t>[2] Mã mẫu BFS của giảng viên (Ma_BFS_mau.zip) — chỉ tham khảo cách tổ chức module, demo, test và chụp ảnh; thuật toán và kiểm thử là tự cài cho đề DT028.</w:t>
+        <w:t>[2] Gói mã mẫu BFS của giảng viên (Ma_BFS_mau.zip): chỉ dùng để xem cách chia module, cách viết demo và cách chụp ảnh minh chứng; phần thuật toán và kiểm thử của DT028 do em tự viết.</w:t>
       </w:r>
     </w:p>
     <w:p>
@@ -13819,7 +13766,7 @@
         <w:jc w:val="left"/>
       </w:pPr>
       <w:r>
-        <w:t>Mỗi nguồn phải được dùng và dẫn trong nội dung; nguồn mã tham khảo ghi rõ phần tiếp nhận và phần tự làm. Không giữ nguồn không sử dụng.</w:t>
+        <w:t>Cả hai nguồn trên đều được dẫn lại trong nội dung; riêng nguồn mã mẫu chỉ ghi phần học được về cách tổ chức, không dùng lại mã.</w:t>
       </w:r>
     </w:p>
     <w:p>
@@ -13860,6 +13807,7 @@
     <w:p>
       <w:pPr>
         <w:pStyle w:val="Nidung"/>
+        <w:jc w:val="left"/>
       </w:pPr>
       <w:r>
         <w:t>Cây tệp kho mã:</w:t>
@@ -13944,7 +13892,7 @@
         <w:pStyle w:val="Nidung"/>
       </w:pPr>
       <w:r>
-        <w:t>Danh mục A01–A09 gồm mã ca, tệp ảnh và log tương ứng; A10–A11 trình bày tại Phụ lục E (Hình 4.10, 4.11). Ảnh trong thân báo cáo phải đọc được.</w:t>
+        <w:t>Danh mục dưới gom đủ mười một ảnh A01–A11, kèm mã ca và tên tệp để đối chiếu với gói ZIP. Chín ảnh đầu nằm trong thân báo cáo, hai ảnh A10 và A11 đặt ở Phụ lục E (Hình 4.10 và 4.11).</w:t>
       </w:r>
     </w:p>
     <w:tbl>
@@ -14512,7 +14460,7 @@
               <w:spacing w:after="40" w:line="252" w:lineRule="auto"/>
             </w:pPr>
             <w:r>
-              <w:t>Chưa có — sinh viên bổ sung sau khi đẩy GitHub</w:t>
+              <w:t>10_clone_sach_chay_lai.png — Hình 4.10, Phụ lục E</w:t>
             </w:r>
           </w:p>
         </w:tc>
@@ -14560,7 +14508,7 @@
               <w:spacing w:after="40" w:line="252" w:lineRule="auto"/>
             </w:pPr>
             <w:r>
-              <w:t>Chưa có — sinh viên bổ sung sau khi đẩy GitHub</w:t>
+              <w:t>11_github_repo_commit.png — Hình 4.11, Phụ lục E</w:t>
             </w:r>
           </w:p>
         </w:tc>
@@ -14591,7 +14539,7 @@
         <w:pStyle w:val="Nidung"/>
       </w:pPr>
       <w:r>
-        <w:t>Đối chiếu checklist 8 của hướng dẫn; xác nhận thông tin cá nhân/đề, &gt;=12 ca, 11 ảnh, ba quy mô hoặc cấu hình hợp lệ, URL/SHA/permalink, clone sạch và DOCX/PDF cùng phiên bản. Đây là xác nhận sản phẩm đã chuẩn bị, không phải điểm chấm.</w:t>
+        <w:t>Phần này đối chiếu tám mục trong checklist của hướng dẫn: thông tin cá nhân và mã đề, số ca kiểm thử, số ảnh, số quy mô khảo sát, URL/SHA/permalink, bản clone chạy lại, và sự khớp giữa DOCX với PDF. Đây chỉ là tự xác nhận sản phẩm đã chuẩn bị đủ, không phải tự chấm điểm.</w:t>
       </w:r>
     </w:p>
     <w:p>
@@ -14624,7 +14572,7 @@
         <w:jc w:val="left"/>
       </w:pPr>
       <w:r>
-        <w:t>□ ≥12 ca độc lập; đủ ví dụ và ca phiếu; ảnh A01–A09 là ảnh chạy thật trong VS Code.</w:t>
+        <w:t>□ 13 ca độc lập, đủ ví dụ và ca phiếu; ảnh A01–A11 đều chụp từ lần chạy thật trong VS Code.</w:t>
       </w:r>
     </w:p>
     <w:p>
@@ -14646,7 +14594,7 @@
         <w:jc w:val="left"/>
       </w:pPr>
       <w:r>
-        <w:t>Đã có A10/A11, URL, SHA C và permalink; SHA S ghi trong ThongTinNop.txt.</w:t>
+        <w:t>□ Đã có A10/A11, URL, SHA C và permalink; SHA S ghi trong ThongTinNop.txt.</w:t>
       </w:r>
     </w:p>
     <w:p>
@@ -14680,7 +14628,7 @@
         <w:jc w:val="left"/>
       </w:pPr>
       <w:r>
-        <w:t>Tiền tố bài cá nhân: N24DCDT034_DT028_PhanDucHuy.</w:t>
+        <w:t>Tên tệp đặt theo mẫu N24DCDT034_DT028_PhanDucHuy: viết không dấu, không khoảng trắng, đúng bốn tệp.</w:t>
       </w:r>
     </w:p>
     <w:p>
@@ -14987,9 +14935,9 @@
       </w:pPr>
       <w:r>
         <w:rPr>
-          <w:sz w:val="24"/>
+          <w:sz w:val="26"/>
         </w:rPr>
-        <w:t>Không nộp nguyên gói mẫu của giảng viên như ZIP cá nhân. Giải nén ZIP của mình ở thư mục mới phải chạy được theo README. Không gói .git, bộ cài, môi trường ảo hoặc cache vào ZIP bài nộp.</w:t>
+        <w:t>Không được lấy nguyên gói mẫu của giảng viên rồi nộp như ZIP cá nhân. ZIP của mình phải giải nén ra thư mục mới và chạy được theo README; đồng thời không chứa .git, bộ cài, môi trường ảo hay cache.</w:t>
       </w:r>
     </w:p>
     <w:p>
@@ -15001,13 +14949,14 @@
       </w:pPr>
       <w:r>
         <w:rPr>
-          <w:sz w:val="24"/>
+          <w:sz w:val="26"/>
         </w:rPr>
-        <w:t>C là commit mã/test/input đã chạy và chụp; S là commit chốt bài sau khi thêm ảnh/báo cáo. Clone S sang thư mục mới rồi chạy lại; nếu mã đổi sau C thì cập nhật test/ảnh chịu ảnh hưởng. SHA S ghi trong TXT nộp rời, không phải commit SHA của chính S vào S.</w:t>
-      </w:r>
-    </w:p>
-    <w:p>
-      <w:pPr>
+        <w:t>Hai mốc cần phân biệt: C là lúc mã, test và dữ liệu đã đứng yên để chụp ảnh; S là lúc chốt toàn bộ bài nộp. Muốn kiểm thì clone S sang một thư mục trống rồi chạy lại; trường hợp mã bị sửa sau C thì test và ảnh liên quan cũng phải làm lại. SHA của S nằm trong tệp TXT nộp kèm.</w:t>
+      </w:r>
+    </w:p>
+    <w:p>
+      <w:pPr>
+        <w:pageBreakBefore/>
         <w:pStyle w:val="Heading3"/>
       </w:pPr>
       <w:r>
@@ -15024,7 +14973,7 @@
       <w:r>
         <w:rPr>
           <w:b/>
-          <w:sz w:val="24"/>
+          <w:sz w:val="26"/>
         </w:rPr>
         <w:t xml:space="preserve">URL GitHub thật: </w:t>
       </w:r>
@@ -15080,7 +15029,7 @@
         <w:jc w:val="left"/>
       </w:pPr>
       <w:r>
-        <w:t>Lệnh chạy hai ví dụ và bộ test: julia --startup-file=no demo.jl --ca=1/--ca=2; julia --startup-file=no test/runtests.jl</w:t>
+        <w:t>Chạy thử: julia --startup-file=no demo.jl --ca=1 rồi --ca=2; sau đó julia --startup-file=no test/runtests.jl. Cả ba lệnh đều dùng cờ --startup-file=no để không nạp cấu hình cá nhân.</w:t>
       </w:r>
     </w:p>
     <w:p>
@@ -15103,27 +15052,23 @@
       </w:pPr>
       <w:r>
         <w:rPr>
-          <w:sz w:val="24"/>
+          <w:sz w:val="26"/>
         </w:rPr>
-        <w:t>Vào đúng bài tập trên Classroom, đính kèm đủ bốn tệp, mở kiểm tra lại rồi bấm Nộp bài. Kiểm tra trạng thái đã nộp; ảnh rời đã nằm trong báo cáo và ZIP nên không cần gắn lại 11 tệp ảnh riêng.</w:t>
-      </w:r>
-    </w:p>
-    <w:p>
-      <w:r>
-        <w:br w:type="page"/>
-      </w:r>
-    </w:p>
-    <w:p>
-      <w:pPr>
+        <w:t>Trên Classroom: mở đúng bài tập, đính kèm đủ bốn tệp, kiểm lại rồi bấm Nộp. Ảnh đã nằm trong báo cáo và ZIP nên không cần gửi lẻ.</w:t>
+      </w:r>
+    </w:p>
+    <w:p>
+      <w:pPr>
+        <w:pageBreakBefore/>
         <w:jc w:val="center"/>
+        <w:outlineLvl w:val="0"/>
       </w:pPr>
       <w:r>
         <w:rPr>
           <w:b/>
           <w:sz w:val="28"/>
         </w:rPr>
-        <w:lastRenderedPageBreak/>
-        <w:t>PHỤ LỤC E — ẢNH MINH CHỨNG A10 VÀ A11</w:t>
+        <w:t>PHỤ LỤC E — HAI ẢNH A10 VÀ A11</w:t>
       </w:r>
     </w:p>
     <w:p>
@@ -15131,7 +15076,7 @@
         <w:jc w:val="both"/>
       </w:pPr>
       <w:r>
-        <w:t>Hai ảnh dưới đây được chụp từ lần chạy thật: A10 kiểm tra clone commit C và chạy lại toàn bộ quy trình; A11 xác nhận repo GitHub và commit C.</w:t>
+        <w:t>Hai ảnh dưới được chụp từ lần chạy thật, không phải ảnh dựng: A10 là màn hình sau khi clone commit C và chạy lại toàn bộ quy trình, A11 là trang kho GitHub tại đúng commit đó.</w:t>
       </w:r>
     </w:p>
     <w:p>
@@ -15186,9 +15131,9 @@
       <w:r>
         <w:rPr>
           <w:i/>
-          <w:sz w:val="20"/>
+          <w:sz w:val="24"/>
         </w:rPr>
-        <w:t>Hình 4.10 — A10: clone commit C 4277eb8, chạy Run_all.ps1, kết thúc END_TO_END_OK.</w:t>
+        <w:t>Hình 4.10 — A10: bản clone tại commit 4277eb8 chạy Run_all.ps1, kết thúc bằng END_TO_END_OK.</w:t>
       </w:r>
     </w:p>
     <w:p>
@@ -15249,9 +15194,9 @@
       <w:r>
         <w:rPr>
           <w:i/>
-          <w:sz w:val="20"/>
+          <w:sz w:val="24"/>
         </w:rPr>
-        <w:t>Hình 4.11 — A11: repo GitHub Mildsivan/ctdl-baocao tại commit C 4277eb8.</w:t>
+        <w:t>Hình 4.11 — A11: kho Mildsivan/ctdl-baocao mở đúng tại commit 4277eb8.</w:t>
       </w:r>
     </w:p>
     <w:sectPr>

</xml_diff>